<commit_message>
load types in boardgames
</commit_message>
<xml_diff>
--- a/Promt con Claude.docx
+++ b/Promt con Claude.docx
@@ -135,7 +135,7 @@
           <w:r>
             <w:fldChar w:fldCharType="separate"/>
           </w:r>
-          <w:hyperlink w:anchor="_Toc227152366" w:history="1">
+          <w:hyperlink w:anchor="_Toc227660513" w:history="1">
             <w:r>
               <w:rPr>
                 <w:rStyle w:val="Hipervnculo"/>
@@ -162,7 +162,7 @@
                 <w:noProof/>
                 <w:webHidden/>
               </w:rPr>
-              <w:instrText xml:space="preserve"> PAGEREF _Toc227152366 \h </w:instrText>
+              <w:instrText xml:space="preserve"> PAGEREF _Toc227660513 \h </w:instrText>
             </w:r>
             <w:r>
               <w:rPr>
@@ -203,7 +203,7 @@
               <w:noProof/>
             </w:rPr>
           </w:pPr>
-          <w:hyperlink w:anchor="_Toc227152367" w:history="1">
+          <w:hyperlink w:anchor="_Toc227660514" w:history="1">
             <w:r>
               <w:rPr>
                 <w:rStyle w:val="Hipervnculo"/>
@@ -230,7 +230,7 @@
                 <w:noProof/>
                 <w:webHidden/>
               </w:rPr>
-              <w:instrText xml:space="preserve"> PAGEREF _Toc227152367 \h </w:instrText>
+              <w:instrText xml:space="preserve"> PAGEREF _Toc227660514 \h </w:instrText>
             </w:r>
             <w:r>
               <w:rPr>
@@ -271,7 +271,7 @@
               <w:noProof/>
             </w:rPr>
           </w:pPr>
-          <w:hyperlink w:anchor="_Toc227152368" w:history="1">
+          <w:hyperlink w:anchor="_Toc227660515" w:history="1">
             <w:r>
               <w:rPr>
                 <w:rStyle w:val="Hipervnculo"/>
@@ -298,7 +298,7 @@
                 <w:noProof/>
                 <w:webHidden/>
               </w:rPr>
-              <w:instrText xml:space="preserve"> PAGEREF _Toc227152368 \h </w:instrText>
+              <w:instrText xml:space="preserve"> PAGEREF _Toc227660515 \h </w:instrText>
             </w:r>
             <w:r>
               <w:rPr>
@@ -339,27 +339,13 @@
               <w:noProof/>
             </w:rPr>
           </w:pPr>
-          <w:hyperlink w:anchor="_Toc227152369" w:history="1">
+          <w:hyperlink w:anchor="_Toc227660516" w:history="1">
             <w:r>
               <w:rPr>
                 <w:rStyle w:val="Hipervnculo"/>
                 <w:noProof/>
               </w:rPr>
-              <w:t>Pr</w:t>
-            </w:r>
-            <w:r>
-              <w:rPr>
-                <w:rStyle w:val="Hipervnculo"/>
-                <w:noProof/>
-              </w:rPr>
-              <w:t>o</w:t>
-            </w:r>
-            <w:r>
-              <w:rPr>
-                <w:rStyle w:val="Hipervnculo"/>
-                <w:noProof/>
-              </w:rPr>
-              <w:t>mt 4 -</w:t>
+              <w:t>Promt 4 – Creando página crud juegos de mesa</w:t>
             </w:r>
             <w:r>
               <w:rPr>
@@ -380,7 +366,7 @@
                 <w:noProof/>
                 <w:webHidden/>
               </w:rPr>
-              <w:instrText xml:space="preserve"> PAGEREF _Toc227152369 \h </w:instrText>
+              <w:instrText xml:space="preserve"> PAGEREF _Toc227660516 \h </w:instrText>
             </w:r>
             <w:r>
               <w:rPr>
@@ -421,13 +407,13 @@
               <w:noProof/>
             </w:rPr>
           </w:pPr>
-          <w:hyperlink w:anchor="_Toc227152370" w:history="1">
+          <w:hyperlink w:anchor="_Toc227660517" w:history="1">
             <w:r>
               <w:rPr>
                 <w:rStyle w:val="Hipervnculo"/>
                 <w:noProof/>
               </w:rPr>
-              <w:t>Promt 5 -</w:t>
+              <w:t>Promt 5 – Retocando crud, propietario y slug</w:t>
             </w:r>
             <w:r>
               <w:rPr>
@@ -448,7 +434,7 @@
                 <w:noProof/>
                 <w:webHidden/>
               </w:rPr>
-              <w:instrText xml:space="preserve"> PAGEREF _Toc227152370 \h </w:instrText>
+              <w:instrText xml:space="preserve"> PAGEREF _Toc227660517 \h </w:instrText>
             </w:r>
             <w:r>
               <w:rPr>
@@ -469,6 +455,1434 @@
                 <w:webHidden/>
               </w:rPr>
               <w:t>12</w:t>
+            </w:r>
+            <w:r>
+              <w:rPr>
+                <w:noProof/>
+                <w:webHidden/>
+              </w:rPr>
+              <w:fldChar w:fldCharType="end"/>
+            </w:r>
+          </w:hyperlink>
+        </w:p>
+        <w:p>
+          <w:pPr>
+            <w:pStyle w:val="TDC1"/>
+            <w:tabs>
+              <w:tab w:val="right" w:leader="dot" w:pos="8494"/>
+            </w:tabs>
+            <w:rPr>
+              <w:noProof/>
+            </w:rPr>
+          </w:pPr>
+          <w:hyperlink w:anchor="_Toc227660518" w:history="1">
+            <w:r>
+              <w:rPr>
+                <w:rStyle w:val="Hipervnculo"/>
+                <w:noProof/>
+              </w:rPr>
+              <w:t>Promt 6 – Retrocediendo por API</w:t>
+            </w:r>
+            <w:r>
+              <w:rPr>
+                <w:noProof/>
+                <w:webHidden/>
+              </w:rPr>
+              <w:tab/>
+            </w:r>
+            <w:r>
+              <w:rPr>
+                <w:noProof/>
+                <w:webHidden/>
+              </w:rPr>
+              <w:fldChar w:fldCharType="begin"/>
+            </w:r>
+            <w:r>
+              <w:rPr>
+                <w:noProof/>
+                <w:webHidden/>
+              </w:rPr>
+              <w:instrText xml:space="preserve"> PAGEREF _Toc227660518 \h </w:instrText>
+            </w:r>
+            <w:r>
+              <w:rPr>
+                <w:noProof/>
+                <w:webHidden/>
+              </w:rPr>
+            </w:r>
+            <w:r>
+              <w:rPr>
+                <w:noProof/>
+                <w:webHidden/>
+              </w:rPr>
+              <w:fldChar w:fldCharType="separate"/>
+            </w:r>
+            <w:r>
+              <w:rPr>
+                <w:noProof/>
+                <w:webHidden/>
+              </w:rPr>
+              <w:t>12</w:t>
+            </w:r>
+            <w:r>
+              <w:rPr>
+                <w:noProof/>
+                <w:webHidden/>
+              </w:rPr>
+              <w:fldChar w:fldCharType="end"/>
+            </w:r>
+          </w:hyperlink>
+        </w:p>
+        <w:p>
+          <w:pPr>
+            <w:pStyle w:val="TDC1"/>
+            <w:tabs>
+              <w:tab w:val="right" w:leader="dot" w:pos="8494"/>
+            </w:tabs>
+            <w:rPr>
+              <w:noProof/>
+            </w:rPr>
+          </w:pPr>
+          <w:hyperlink w:anchor="_Toc227660519" w:history="1">
+            <w:r>
+              <w:rPr>
+                <w:rStyle w:val="Hipervnculo"/>
+                <w:noProof/>
+              </w:rPr>
+              <w:t>Promt 7 – Crud types</w:t>
+            </w:r>
+            <w:r>
+              <w:rPr>
+                <w:noProof/>
+                <w:webHidden/>
+              </w:rPr>
+              <w:tab/>
+            </w:r>
+            <w:r>
+              <w:rPr>
+                <w:noProof/>
+                <w:webHidden/>
+              </w:rPr>
+              <w:fldChar w:fldCharType="begin"/>
+            </w:r>
+            <w:r>
+              <w:rPr>
+                <w:noProof/>
+                <w:webHidden/>
+              </w:rPr>
+              <w:instrText xml:space="preserve"> PAGEREF _Toc227660519 \h </w:instrText>
+            </w:r>
+            <w:r>
+              <w:rPr>
+                <w:noProof/>
+                <w:webHidden/>
+              </w:rPr>
+            </w:r>
+            <w:r>
+              <w:rPr>
+                <w:noProof/>
+                <w:webHidden/>
+              </w:rPr>
+              <w:fldChar w:fldCharType="separate"/>
+            </w:r>
+            <w:r>
+              <w:rPr>
+                <w:noProof/>
+                <w:webHidden/>
+              </w:rPr>
+              <w:t>12</w:t>
+            </w:r>
+            <w:r>
+              <w:rPr>
+                <w:noProof/>
+                <w:webHidden/>
+              </w:rPr>
+              <w:fldChar w:fldCharType="end"/>
+            </w:r>
+          </w:hyperlink>
+        </w:p>
+        <w:p>
+          <w:pPr>
+            <w:pStyle w:val="TDC1"/>
+            <w:tabs>
+              <w:tab w:val="right" w:leader="dot" w:pos="8494"/>
+            </w:tabs>
+            <w:rPr>
+              <w:noProof/>
+            </w:rPr>
+          </w:pPr>
+          <w:hyperlink w:anchor="_Toc227660520" w:history="1">
+            <w:r>
+              <w:rPr>
+                <w:rStyle w:val="Hipervnculo"/>
+                <w:noProof/>
+              </w:rPr>
+              <w:t>Promt 8 – Profile page</w:t>
+            </w:r>
+            <w:r>
+              <w:rPr>
+                <w:noProof/>
+                <w:webHidden/>
+              </w:rPr>
+              <w:tab/>
+            </w:r>
+            <w:r>
+              <w:rPr>
+                <w:noProof/>
+                <w:webHidden/>
+              </w:rPr>
+              <w:fldChar w:fldCharType="begin"/>
+            </w:r>
+            <w:r>
+              <w:rPr>
+                <w:noProof/>
+                <w:webHidden/>
+              </w:rPr>
+              <w:instrText xml:space="preserve"> PAGEREF _Toc227660520 \h </w:instrText>
+            </w:r>
+            <w:r>
+              <w:rPr>
+                <w:noProof/>
+                <w:webHidden/>
+              </w:rPr>
+            </w:r>
+            <w:r>
+              <w:rPr>
+                <w:noProof/>
+                <w:webHidden/>
+              </w:rPr>
+              <w:fldChar w:fldCharType="separate"/>
+            </w:r>
+            <w:r>
+              <w:rPr>
+                <w:noProof/>
+                <w:webHidden/>
+              </w:rPr>
+              <w:t>13</w:t>
+            </w:r>
+            <w:r>
+              <w:rPr>
+                <w:noProof/>
+                <w:webHidden/>
+              </w:rPr>
+              <w:fldChar w:fldCharType="end"/>
+            </w:r>
+          </w:hyperlink>
+        </w:p>
+        <w:p>
+          <w:pPr>
+            <w:pStyle w:val="TDC1"/>
+            <w:tabs>
+              <w:tab w:val="right" w:leader="dot" w:pos="8494"/>
+            </w:tabs>
+            <w:rPr>
+              <w:noProof/>
+            </w:rPr>
+          </w:pPr>
+          <w:hyperlink w:anchor="_Toc227660521" w:history="1">
+            <w:r>
+              <w:rPr>
+                <w:rStyle w:val="Hipervnculo"/>
+                <w:noProof/>
+              </w:rPr>
+              <w:t>Promt 9 – Retocando profile</w:t>
+            </w:r>
+            <w:r>
+              <w:rPr>
+                <w:noProof/>
+                <w:webHidden/>
+              </w:rPr>
+              <w:tab/>
+            </w:r>
+            <w:r>
+              <w:rPr>
+                <w:noProof/>
+                <w:webHidden/>
+              </w:rPr>
+              <w:fldChar w:fldCharType="begin"/>
+            </w:r>
+            <w:r>
+              <w:rPr>
+                <w:noProof/>
+                <w:webHidden/>
+              </w:rPr>
+              <w:instrText xml:space="preserve"> PAGEREF _Toc227660521 \h </w:instrText>
+            </w:r>
+            <w:r>
+              <w:rPr>
+                <w:noProof/>
+                <w:webHidden/>
+              </w:rPr>
+            </w:r>
+            <w:r>
+              <w:rPr>
+                <w:noProof/>
+                <w:webHidden/>
+              </w:rPr>
+              <w:fldChar w:fldCharType="separate"/>
+            </w:r>
+            <w:r>
+              <w:rPr>
+                <w:noProof/>
+                <w:webHidden/>
+              </w:rPr>
+              <w:t>13</w:t>
+            </w:r>
+            <w:r>
+              <w:rPr>
+                <w:noProof/>
+                <w:webHidden/>
+              </w:rPr>
+              <w:fldChar w:fldCharType="end"/>
+            </w:r>
+          </w:hyperlink>
+        </w:p>
+        <w:p>
+          <w:pPr>
+            <w:pStyle w:val="TDC1"/>
+            <w:tabs>
+              <w:tab w:val="right" w:leader="dot" w:pos="8494"/>
+            </w:tabs>
+            <w:rPr>
+              <w:noProof/>
+            </w:rPr>
+          </w:pPr>
+          <w:hyperlink w:anchor="_Toc227660522" w:history="1">
+            <w:r>
+              <w:rPr>
+                <w:rStyle w:val="Hipervnculo"/>
+                <w:noProof/>
+              </w:rPr>
+              <w:t>Promt 10 – Aclarando estilos con la IA</w:t>
+            </w:r>
+            <w:r>
+              <w:rPr>
+                <w:noProof/>
+                <w:webHidden/>
+              </w:rPr>
+              <w:tab/>
+            </w:r>
+            <w:r>
+              <w:rPr>
+                <w:noProof/>
+                <w:webHidden/>
+              </w:rPr>
+              <w:fldChar w:fldCharType="begin"/>
+            </w:r>
+            <w:r>
+              <w:rPr>
+                <w:noProof/>
+                <w:webHidden/>
+              </w:rPr>
+              <w:instrText xml:space="preserve"> PAGEREF _Toc227660522 \h </w:instrText>
+            </w:r>
+            <w:r>
+              <w:rPr>
+                <w:noProof/>
+                <w:webHidden/>
+              </w:rPr>
+            </w:r>
+            <w:r>
+              <w:rPr>
+                <w:noProof/>
+                <w:webHidden/>
+              </w:rPr>
+              <w:fldChar w:fldCharType="separate"/>
+            </w:r>
+            <w:r>
+              <w:rPr>
+                <w:noProof/>
+                <w:webHidden/>
+              </w:rPr>
+              <w:t>13</w:t>
+            </w:r>
+            <w:r>
+              <w:rPr>
+                <w:noProof/>
+                <w:webHidden/>
+              </w:rPr>
+              <w:fldChar w:fldCharType="end"/>
+            </w:r>
+          </w:hyperlink>
+        </w:p>
+        <w:p>
+          <w:pPr>
+            <w:pStyle w:val="TDC1"/>
+            <w:tabs>
+              <w:tab w:val="right" w:leader="dot" w:pos="8494"/>
+            </w:tabs>
+            <w:rPr>
+              <w:noProof/>
+            </w:rPr>
+          </w:pPr>
+          <w:hyperlink w:anchor="_Toc227660523" w:history="1">
+            <w:r>
+              <w:rPr>
+                <w:rStyle w:val="Hipervnculo"/>
+                <w:noProof/>
+              </w:rPr>
+              <w:t>Promt 11 – Actualizando navbar</w:t>
+            </w:r>
+            <w:r>
+              <w:rPr>
+                <w:noProof/>
+                <w:webHidden/>
+              </w:rPr>
+              <w:tab/>
+            </w:r>
+            <w:r>
+              <w:rPr>
+                <w:noProof/>
+                <w:webHidden/>
+              </w:rPr>
+              <w:fldChar w:fldCharType="begin"/>
+            </w:r>
+            <w:r>
+              <w:rPr>
+                <w:noProof/>
+                <w:webHidden/>
+              </w:rPr>
+              <w:instrText xml:space="preserve"> PAGEREF _Toc227660523 \h </w:instrText>
+            </w:r>
+            <w:r>
+              <w:rPr>
+                <w:noProof/>
+                <w:webHidden/>
+              </w:rPr>
+            </w:r>
+            <w:r>
+              <w:rPr>
+                <w:noProof/>
+                <w:webHidden/>
+              </w:rPr>
+              <w:fldChar w:fldCharType="separate"/>
+            </w:r>
+            <w:r>
+              <w:rPr>
+                <w:noProof/>
+                <w:webHidden/>
+              </w:rPr>
+              <w:t>13</w:t>
+            </w:r>
+            <w:r>
+              <w:rPr>
+                <w:noProof/>
+                <w:webHidden/>
+              </w:rPr>
+              <w:fldChar w:fldCharType="end"/>
+            </w:r>
+          </w:hyperlink>
+        </w:p>
+        <w:p>
+          <w:pPr>
+            <w:pStyle w:val="TDC1"/>
+            <w:tabs>
+              <w:tab w:val="right" w:leader="dot" w:pos="8494"/>
+            </w:tabs>
+            <w:rPr>
+              <w:noProof/>
+            </w:rPr>
+          </w:pPr>
+          <w:hyperlink w:anchor="_Toc227660524" w:history="1">
+            <w:r>
+              <w:rPr>
+                <w:rStyle w:val="Hipervnculo"/>
+                <w:noProof/>
+              </w:rPr>
+              <w:t>Promt 12 – Crud sesiones</w:t>
+            </w:r>
+            <w:r>
+              <w:rPr>
+                <w:noProof/>
+                <w:webHidden/>
+              </w:rPr>
+              <w:tab/>
+            </w:r>
+            <w:r>
+              <w:rPr>
+                <w:noProof/>
+                <w:webHidden/>
+              </w:rPr>
+              <w:fldChar w:fldCharType="begin"/>
+            </w:r>
+            <w:r>
+              <w:rPr>
+                <w:noProof/>
+                <w:webHidden/>
+              </w:rPr>
+              <w:instrText xml:space="preserve"> PAGEREF _Toc227660524 \h </w:instrText>
+            </w:r>
+            <w:r>
+              <w:rPr>
+                <w:noProof/>
+                <w:webHidden/>
+              </w:rPr>
+            </w:r>
+            <w:r>
+              <w:rPr>
+                <w:noProof/>
+                <w:webHidden/>
+              </w:rPr>
+              <w:fldChar w:fldCharType="separate"/>
+            </w:r>
+            <w:r>
+              <w:rPr>
+                <w:noProof/>
+                <w:webHidden/>
+              </w:rPr>
+              <w:t>13</w:t>
+            </w:r>
+            <w:r>
+              <w:rPr>
+                <w:noProof/>
+                <w:webHidden/>
+              </w:rPr>
+              <w:fldChar w:fldCharType="end"/>
+            </w:r>
+          </w:hyperlink>
+        </w:p>
+        <w:p>
+          <w:pPr>
+            <w:pStyle w:val="TDC1"/>
+            <w:tabs>
+              <w:tab w:val="right" w:leader="dot" w:pos="8494"/>
+            </w:tabs>
+            <w:rPr>
+              <w:noProof/>
+            </w:rPr>
+          </w:pPr>
+          <w:hyperlink w:anchor="_Toc227660525" w:history="1">
+            <w:r>
+              <w:rPr>
+                <w:rStyle w:val="Hipervnculo"/>
+                <w:noProof/>
+              </w:rPr>
+              <w:t>Promt 13 – Arreglar formato hora</w:t>
+            </w:r>
+            <w:r>
+              <w:rPr>
+                <w:noProof/>
+                <w:webHidden/>
+              </w:rPr>
+              <w:tab/>
+            </w:r>
+            <w:r>
+              <w:rPr>
+                <w:noProof/>
+                <w:webHidden/>
+              </w:rPr>
+              <w:fldChar w:fldCharType="begin"/>
+            </w:r>
+            <w:r>
+              <w:rPr>
+                <w:noProof/>
+                <w:webHidden/>
+              </w:rPr>
+              <w:instrText xml:space="preserve"> PAGEREF _Toc227660525 \h </w:instrText>
+            </w:r>
+            <w:r>
+              <w:rPr>
+                <w:noProof/>
+                <w:webHidden/>
+              </w:rPr>
+            </w:r>
+            <w:r>
+              <w:rPr>
+                <w:noProof/>
+                <w:webHidden/>
+              </w:rPr>
+              <w:fldChar w:fldCharType="separate"/>
+            </w:r>
+            <w:r>
+              <w:rPr>
+                <w:noProof/>
+                <w:webHidden/>
+              </w:rPr>
+              <w:t>14</w:t>
+            </w:r>
+            <w:r>
+              <w:rPr>
+                <w:noProof/>
+                <w:webHidden/>
+              </w:rPr>
+              <w:fldChar w:fldCharType="end"/>
+            </w:r>
+          </w:hyperlink>
+        </w:p>
+        <w:p>
+          <w:pPr>
+            <w:pStyle w:val="TDC1"/>
+            <w:tabs>
+              <w:tab w:val="right" w:leader="dot" w:pos="8494"/>
+            </w:tabs>
+            <w:rPr>
+              <w:noProof/>
+            </w:rPr>
+          </w:pPr>
+          <w:hyperlink w:anchor="_Toc227660526" w:history="1">
+            <w:r>
+              <w:rPr>
+                <w:rStyle w:val="Hipervnculo"/>
+                <w:noProof/>
+              </w:rPr>
+              <w:t>Promt 14 – Añadiendo limitaciones</w:t>
+            </w:r>
+            <w:r>
+              <w:rPr>
+                <w:noProof/>
+                <w:webHidden/>
+              </w:rPr>
+              <w:tab/>
+            </w:r>
+            <w:r>
+              <w:rPr>
+                <w:noProof/>
+                <w:webHidden/>
+              </w:rPr>
+              <w:fldChar w:fldCharType="begin"/>
+            </w:r>
+            <w:r>
+              <w:rPr>
+                <w:noProof/>
+                <w:webHidden/>
+              </w:rPr>
+              <w:instrText xml:space="preserve"> PAGEREF _Toc227660526 \h </w:instrText>
+            </w:r>
+            <w:r>
+              <w:rPr>
+                <w:noProof/>
+                <w:webHidden/>
+              </w:rPr>
+            </w:r>
+            <w:r>
+              <w:rPr>
+                <w:noProof/>
+                <w:webHidden/>
+              </w:rPr>
+              <w:fldChar w:fldCharType="separate"/>
+            </w:r>
+            <w:r>
+              <w:rPr>
+                <w:noProof/>
+                <w:webHidden/>
+              </w:rPr>
+              <w:t>14</w:t>
+            </w:r>
+            <w:r>
+              <w:rPr>
+                <w:noProof/>
+                <w:webHidden/>
+              </w:rPr>
+              <w:fldChar w:fldCharType="end"/>
+            </w:r>
+          </w:hyperlink>
+        </w:p>
+        <w:p>
+          <w:pPr>
+            <w:pStyle w:val="TDC1"/>
+            <w:tabs>
+              <w:tab w:val="right" w:leader="dot" w:pos="8494"/>
+            </w:tabs>
+            <w:rPr>
+              <w:noProof/>
+            </w:rPr>
+          </w:pPr>
+          <w:hyperlink w:anchor="_Toc227660527" w:history="1">
+            <w:r>
+              <w:rPr>
+                <w:rStyle w:val="Hipervnculo"/>
+                <w:noProof/>
+              </w:rPr>
+              <w:t>Promt 15 – Volver a pedir tema ovidado</w:t>
+            </w:r>
+            <w:r>
+              <w:rPr>
+                <w:noProof/>
+                <w:webHidden/>
+              </w:rPr>
+              <w:tab/>
+            </w:r>
+            <w:r>
+              <w:rPr>
+                <w:noProof/>
+                <w:webHidden/>
+              </w:rPr>
+              <w:fldChar w:fldCharType="begin"/>
+            </w:r>
+            <w:r>
+              <w:rPr>
+                <w:noProof/>
+                <w:webHidden/>
+              </w:rPr>
+              <w:instrText xml:space="preserve"> PAGEREF _Toc227660527 \h </w:instrText>
+            </w:r>
+            <w:r>
+              <w:rPr>
+                <w:noProof/>
+                <w:webHidden/>
+              </w:rPr>
+            </w:r>
+            <w:r>
+              <w:rPr>
+                <w:noProof/>
+                <w:webHidden/>
+              </w:rPr>
+              <w:fldChar w:fldCharType="separate"/>
+            </w:r>
+            <w:r>
+              <w:rPr>
+                <w:noProof/>
+                <w:webHidden/>
+              </w:rPr>
+              <w:t>14</w:t>
+            </w:r>
+            <w:r>
+              <w:rPr>
+                <w:noProof/>
+                <w:webHidden/>
+              </w:rPr>
+              <w:fldChar w:fldCharType="end"/>
+            </w:r>
+          </w:hyperlink>
+        </w:p>
+        <w:p>
+          <w:pPr>
+            <w:pStyle w:val="TDC1"/>
+            <w:tabs>
+              <w:tab w:val="right" w:leader="dot" w:pos="8494"/>
+            </w:tabs>
+            <w:rPr>
+              <w:noProof/>
+            </w:rPr>
+          </w:pPr>
+          <w:hyperlink w:anchor="_Toc227660528" w:history="1">
+            <w:r>
+              <w:rPr>
+                <w:rStyle w:val="Hipervnculo"/>
+                <w:noProof/>
+              </w:rPr>
+              <w:t>Promt 16 – Cambiar nombre partidas y jugadores</w:t>
+            </w:r>
+            <w:r>
+              <w:rPr>
+                <w:noProof/>
+                <w:webHidden/>
+              </w:rPr>
+              <w:tab/>
+            </w:r>
+            <w:r>
+              <w:rPr>
+                <w:noProof/>
+                <w:webHidden/>
+              </w:rPr>
+              <w:fldChar w:fldCharType="begin"/>
+            </w:r>
+            <w:r>
+              <w:rPr>
+                <w:noProof/>
+                <w:webHidden/>
+              </w:rPr>
+              <w:instrText xml:space="preserve"> PAGEREF _Toc227660528 \h </w:instrText>
+            </w:r>
+            <w:r>
+              <w:rPr>
+                <w:noProof/>
+                <w:webHidden/>
+              </w:rPr>
+            </w:r>
+            <w:r>
+              <w:rPr>
+                <w:noProof/>
+                <w:webHidden/>
+              </w:rPr>
+              <w:fldChar w:fldCharType="separate"/>
+            </w:r>
+            <w:r>
+              <w:rPr>
+                <w:noProof/>
+                <w:webHidden/>
+              </w:rPr>
+              <w:t>15</w:t>
+            </w:r>
+            <w:r>
+              <w:rPr>
+                <w:noProof/>
+                <w:webHidden/>
+              </w:rPr>
+              <w:fldChar w:fldCharType="end"/>
+            </w:r>
+          </w:hyperlink>
+        </w:p>
+        <w:p>
+          <w:pPr>
+            <w:pStyle w:val="TDC1"/>
+            <w:tabs>
+              <w:tab w:val="right" w:leader="dot" w:pos="8494"/>
+            </w:tabs>
+            <w:rPr>
+              <w:noProof/>
+            </w:rPr>
+          </w:pPr>
+          <w:hyperlink w:anchor="_Toc227660529" w:history="1">
+            <w:r>
+              <w:rPr>
+                <w:rStyle w:val="Hipervnculo"/>
+                <w:noProof/>
+              </w:rPr>
+              <w:t>Promt 17 – Arreglar registro usuario</w:t>
+            </w:r>
+            <w:r>
+              <w:rPr>
+                <w:noProof/>
+                <w:webHidden/>
+              </w:rPr>
+              <w:tab/>
+            </w:r>
+            <w:r>
+              <w:rPr>
+                <w:noProof/>
+                <w:webHidden/>
+              </w:rPr>
+              <w:fldChar w:fldCharType="begin"/>
+            </w:r>
+            <w:r>
+              <w:rPr>
+                <w:noProof/>
+                <w:webHidden/>
+              </w:rPr>
+              <w:instrText xml:space="preserve"> PAGEREF _Toc227660529 \h </w:instrText>
+            </w:r>
+            <w:r>
+              <w:rPr>
+                <w:noProof/>
+                <w:webHidden/>
+              </w:rPr>
+            </w:r>
+            <w:r>
+              <w:rPr>
+                <w:noProof/>
+                <w:webHidden/>
+              </w:rPr>
+              <w:fldChar w:fldCharType="separate"/>
+            </w:r>
+            <w:r>
+              <w:rPr>
+                <w:noProof/>
+                <w:webHidden/>
+              </w:rPr>
+              <w:t>15</w:t>
+            </w:r>
+            <w:r>
+              <w:rPr>
+                <w:noProof/>
+                <w:webHidden/>
+              </w:rPr>
+              <w:fldChar w:fldCharType="end"/>
+            </w:r>
+          </w:hyperlink>
+        </w:p>
+        <w:p>
+          <w:pPr>
+            <w:pStyle w:val="TDC1"/>
+            <w:tabs>
+              <w:tab w:val="right" w:leader="dot" w:pos="8494"/>
+            </w:tabs>
+            <w:rPr>
+              <w:noProof/>
+            </w:rPr>
+          </w:pPr>
+          <w:hyperlink w:anchor="_Toc227660530" w:history="1">
+            <w:r>
+              <w:rPr>
+                <w:rStyle w:val="Hipervnculo"/>
+                <w:noProof/>
+              </w:rPr>
+              <w:t>Promt 18 – No poner num_partner obligatorio</w:t>
+            </w:r>
+            <w:r>
+              <w:rPr>
+                <w:noProof/>
+                <w:webHidden/>
+              </w:rPr>
+              <w:tab/>
+            </w:r>
+            <w:r>
+              <w:rPr>
+                <w:noProof/>
+                <w:webHidden/>
+              </w:rPr>
+              <w:fldChar w:fldCharType="begin"/>
+            </w:r>
+            <w:r>
+              <w:rPr>
+                <w:noProof/>
+                <w:webHidden/>
+              </w:rPr>
+              <w:instrText xml:space="preserve"> PAGEREF _Toc227660530 \h </w:instrText>
+            </w:r>
+            <w:r>
+              <w:rPr>
+                <w:noProof/>
+                <w:webHidden/>
+              </w:rPr>
+            </w:r>
+            <w:r>
+              <w:rPr>
+                <w:noProof/>
+                <w:webHidden/>
+              </w:rPr>
+              <w:fldChar w:fldCharType="separate"/>
+            </w:r>
+            <w:r>
+              <w:rPr>
+                <w:noProof/>
+                <w:webHidden/>
+              </w:rPr>
+              <w:t>15</w:t>
+            </w:r>
+            <w:r>
+              <w:rPr>
+                <w:noProof/>
+                <w:webHidden/>
+              </w:rPr>
+              <w:fldChar w:fldCharType="end"/>
+            </w:r>
+          </w:hyperlink>
+        </w:p>
+        <w:p>
+          <w:pPr>
+            <w:pStyle w:val="TDC1"/>
+            <w:tabs>
+              <w:tab w:val="right" w:leader="dot" w:pos="8494"/>
+            </w:tabs>
+            <w:rPr>
+              <w:noProof/>
+            </w:rPr>
+          </w:pPr>
+          <w:hyperlink w:anchor="_Toc227660531" w:history="1">
+            <w:r>
+              <w:rPr>
+                <w:rStyle w:val="Hipervnculo"/>
+                <w:noProof/>
+              </w:rPr>
+              <w:t>Promt 19 – Mensajes limitados a 5 segundos</w:t>
+            </w:r>
+            <w:r>
+              <w:rPr>
+                <w:noProof/>
+                <w:webHidden/>
+              </w:rPr>
+              <w:tab/>
+            </w:r>
+            <w:r>
+              <w:rPr>
+                <w:noProof/>
+                <w:webHidden/>
+              </w:rPr>
+              <w:fldChar w:fldCharType="begin"/>
+            </w:r>
+            <w:r>
+              <w:rPr>
+                <w:noProof/>
+                <w:webHidden/>
+              </w:rPr>
+              <w:instrText xml:space="preserve"> PAGEREF _Toc227660531 \h </w:instrText>
+            </w:r>
+            <w:r>
+              <w:rPr>
+                <w:noProof/>
+                <w:webHidden/>
+              </w:rPr>
+            </w:r>
+            <w:r>
+              <w:rPr>
+                <w:noProof/>
+                <w:webHidden/>
+              </w:rPr>
+              <w:fldChar w:fldCharType="separate"/>
+            </w:r>
+            <w:r>
+              <w:rPr>
+                <w:noProof/>
+                <w:webHidden/>
+              </w:rPr>
+              <w:t>15</w:t>
+            </w:r>
+            <w:r>
+              <w:rPr>
+                <w:noProof/>
+                <w:webHidden/>
+              </w:rPr>
+              <w:fldChar w:fldCharType="end"/>
+            </w:r>
+          </w:hyperlink>
+        </w:p>
+        <w:p>
+          <w:pPr>
+            <w:pStyle w:val="TDC1"/>
+            <w:tabs>
+              <w:tab w:val="right" w:leader="dot" w:pos="8494"/>
+            </w:tabs>
+            <w:rPr>
+              <w:noProof/>
+            </w:rPr>
+          </w:pPr>
+          <w:hyperlink w:anchor="_Toc227660532" w:history="1">
+            <w:r>
+              <w:rPr>
+                <w:rStyle w:val="Hipervnculo"/>
+                <w:noProof/>
+              </w:rPr>
+              <w:t>Promt 20 – Indicar propietario en juegos de mesa</w:t>
+            </w:r>
+            <w:r>
+              <w:rPr>
+                <w:noProof/>
+                <w:webHidden/>
+              </w:rPr>
+              <w:tab/>
+            </w:r>
+            <w:r>
+              <w:rPr>
+                <w:noProof/>
+                <w:webHidden/>
+              </w:rPr>
+              <w:fldChar w:fldCharType="begin"/>
+            </w:r>
+            <w:r>
+              <w:rPr>
+                <w:noProof/>
+                <w:webHidden/>
+              </w:rPr>
+              <w:instrText xml:space="preserve"> PAGEREF _Toc227660532 \h </w:instrText>
+            </w:r>
+            <w:r>
+              <w:rPr>
+                <w:noProof/>
+                <w:webHidden/>
+              </w:rPr>
+            </w:r>
+            <w:r>
+              <w:rPr>
+                <w:noProof/>
+                <w:webHidden/>
+              </w:rPr>
+              <w:fldChar w:fldCharType="separate"/>
+            </w:r>
+            <w:r>
+              <w:rPr>
+                <w:noProof/>
+                <w:webHidden/>
+              </w:rPr>
+              <w:t>16</w:t>
+            </w:r>
+            <w:r>
+              <w:rPr>
+                <w:noProof/>
+                <w:webHidden/>
+              </w:rPr>
+              <w:fldChar w:fldCharType="end"/>
+            </w:r>
+          </w:hyperlink>
+        </w:p>
+        <w:p>
+          <w:pPr>
+            <w:pStyle w:val="TDC1"/>
+            <w:tabs>
+              <w:tab w:val="right" w:leader="dot" w:pos="8494"/>
+            </w:tabs>
+            <w:rPr>
+              <w:noProof/>
+            </w:rPr>
+          </w:pPr>
+          <w:hyperlink w:anchor="_Toc227660533" w:history="1">
+            <w:r>
+              <w:rPr>
+                <w:rStyle w:val="Hipervnculo"/>
+                <w:noProof/>
+              </w:rPr>
+              <w:t>Promt 21 – Cambiar como muestra el propietario</w:t>
+            </w:r>
+            <w:r>
+              <w:rPr>
+                <w:noProof/>
+                <w:webHidden/>
+              </w:rPr>
+              <w:tab/>
+            </w:r>
+            <w:r>
+              <w:rPr>
+                <w:noProof/>
+                <w:webHidden/>
+              </w:rPr>
+              <w:fldChar w:fldCharType="begin"/>
+            </w:r>
+            <w:r>
+              <w:rPr>
+                <w:noProof/>
+                <w:webHidden/>
+              </w:rPr>
+              <w:instrText xml:space="preserve"> PAGEREF _Toc227660533 \h </w:instrText>
+            </w:r>
+            <w:r>
+              <w:rPr>
+                <w:noProof/>
+                <w:webHidden/>
+              </w:rPr>
+            </w:r>
+            <w:r>
+              <w:rPr>
+                <w:noProof/>
+                <w:webHidden/>
+              </w:rPr>
+              <w:fldChar w:fldCharType="separate"/>
+            </w:r>
+            <w:r>
+              <w:rPr>
+                <w:noProof/>
+                <w:webHidden/>
+              </w:rPr>
+              <w:t>16</w:t>
+            </w:r>
+            <w:r>
+              <w:rPr>
+                <w:noProof/>
+                <w:webHidden/>
+              </w:rPr>
+              <w:fldChar w:fldCharType="end"/>
+            </w:r>
+          </w:hyperlink>
+        </w:p>
+        <w:p>
+          <w:pPr>
+            <w:pStyle w:val="TDC1"/>
+            <w:tabs>
+              <w:tab w:val="right" w:leader="dot" w:pos="8494"/>
+            </w:tabs>
+            <w:rPr>
+              <w:noProof/>
+            </w:rPr>
+          </w:pPr>
+          <w:hyperlink w:anchor="_Toc227660534" w:history="1">
+            <w:r>
+              <w:rPr>
+                <w:rStyle w:val="Hipervnculo"/>
+                <w:noProof/>
+              </w:rPr>
+              <w:t>Promt 22 – Añadir creador de partida en listado de sesión</w:t>
+            </w:r>
+            <w:r>
+              <w:rPr>
+                <w:noProof/>
+                <w:webHidden/>
+              </w:rPr>
+              <w:tab/>
+            </w:r>
+            <w:r>
+              <w:rPr>
+                <w:noProof/>
+                <w:webHidden/>
+              </w:rPr>
+              <w:fldChar w:fldCharType="begin"/>
+            </w:r>
+            <w:r>
+              <w:rPr>
+                <w:noProof/>
+                <w:webHidden/>
+              </w:rPr>
+              <w:instrText xml:space="preserve"> PAGEREF _Toc227660534 \h </w:instrText>
+            </w:r>
+            <w:r>
+              <w:rPr>
+                <w:noProof/>
+                <w:webHidden/>
+              </w:rPr>
+            </w:r>
+            <w:r>
+              <w:rPr>
+                <w:noProof/>
+                <w:webHidden/>
+              </w:rPr>
+              <w:fldChar w:fldCharType="separate"/>
+            </w:r>
+            <w:r>
+              <w:rPr>
+                <w:noProof/>
+                <w:webHidden/>
+              </w:rPr>
+              <w:t>16</w:t>
+            </w:r>
+            <w:r>
+              <w:rPr>
+                <w:noProof/>
+                <w:webHidden/>
+              </w:rPr>
+              <w:fldChar w:fldCharType="end"/>
+            </w:r>
+          </w:hyperlink>
+        </w:p>
+        <w:p>
+          <w:pPr>
+            <w:pStyle w:val="TDC1"/>
+            <w:tabs>
+              <w:tab w:val="right" w:leader="dot" w:pos="8494"/>
+            </w:tabs>
+            <w:rPr>
+              <w:noProof/>
+            </w:rPr>
+          </w:pPr>
+          <w:hyperlink w:anchor="_Toc227660535" w:history="1">
+            <w:r>
+              <w:rPr>
+                <w:rStyle w:val="Hipervnculo"/>
+                <w:noProof/>
+              </w:rPr>
+              <w:t>Promt 23 – Cambiar color botón editar</w:t>
+            </w:r>
+            <w:r>
+              <w:rPr>
+                <w:noProof/>
+                <w:webHidden/>
+              </w:rPr>
+              <w:tab/>
+            </w:r>
+            <w:r>
+              <w:rPr>
+                <w:noProof/>
+                <w:webHidden/>
+              </w:rPr>
+              <w:fldChar w:fldCharType="begin"/>
+            </w:r>
+            <w:r>
+              <w:rPr>
+                <w:noProof/>
+                <w:webHidden/>
+              </w:rPr>
+              <w:instrText xml:space="preserve"> PAGEREF _Toc227660535 \h </w:instrText>
+            </w:r>
+            <w:r>
+              <w:rPr>
+                <w:noProof/>
+                <w:webHidden/>
+              </w:rPr>
+            </w:r>
+            <w:r>
+              <w:rPr>
+                <w:noProof/>
+                <w:webHidden/>
+              </w:rPr>
+              <w:fldChar w:fldCharType="separate"/>
+            </w:r>
+            <w:r>
+              <w:rPr>
+                <w:noProof/>
+                <w:webHidden/>
+              </w:rPr>
+              <w:t>16</w:t>
+            </w:r>
+            <w:r>
+              <w:rPr>
+                <w:noProof/>
+                <w:webHidden/>
+              </w:rPr>
+              <w:fldChar w:fldCharType="end"/>
+            </w:r>
+          </w:hyperlink>
+        </w:p>
+        <w:p>
+          <w:pPr>
+            <w:pStyle w:val="TDC1"/>
+            <w:tabs>
+              <w:tab w:val="right" w:leader="dot" w:pos="8494"/>
+            </w:tabs>
+            <w:rPr>
+              <w:noProof/>
+            </w:rPr>
+          </w:pPr>
+          <w:hyperlink w:anchor="_Toc227660536" w:history="1">
+            <w:r>
+              <w:rPr>
+                <w:rStyle w:val="Hipervnculo"/>
+                <w:noProof/>
+              </w:rPr>
+              <w:t>Promt 24 – Ver jugadores en edición de partida y dar opción a borrarlos</w:t>
+            </w:r>
+            <w:r>
+              <w:rPr>
+                <w:noProof/>
+                <w:webHidden/>
+              </w:rPr>
+              <w:tab/>
+            </w:r>
+            <w:r>
+              <w:rPr>
+                <w:noProof/>
+                <w:webHidden/>
+              </w:rPr>
+              <w:fldChar w:fldCharType="begin"/>
+            </w:r>
+            <w:r>
+              <w:rPr>
+                <w:noProof/>
+                <w:webHidden/>
+              </w:rPr>
+              <w:instrText xml:space="preserve"> PAGEREF _Toc227660536 \h </w:instrText>
+            </w:r>
+            <w:r>
+              <w:rPr>
+                <w:noProof/>
+                <w:webHidden/>
+              </w:rPr>
+            </w:r>
+            <w:r>
+              <w:rPr>
+                <w:noProof/>
+                <w:webHidden/>
+              </w:rPr>
+              <w:fldChar w:fldCharType="separate"/>
+            </w:r>
+            <w:r>
+              <w:rPr>
+                <w:noProof/>
+                <w:webHidden/>
+              </w:rPr>
+              <w:t>16</w:t>
+            </w:r>
+            <w:r>
+              <w:rPr>
+                <w:noProof/>
+                <w:webHidden/>
+              </w:rPr>
+              <w:fldChar w:fldCharType="end"/>
+            </w:r>
+          </w:hyperlink>
+        </w:p>
+        <w:p>
+          <w:pPr>
+            <w:pStyle w:val="TDC1"/>
+            <w:tabs>
+              <w:tab w:val="right" w:leader="dot" w:pos="8494"/>
+            </w:tabs>
+            <w:rPr>
+              <w:noProof/>
+            </w:rPr>
+          </w:pPr>
+          <w:hyperlink w:anchor="_Toc227660537" w:history="1">
+            <w:r>
+              <w:rPr>
+                <w:rStyle w:val="Hipervnculo"/>
+                <w:noProof/>
+              </w:rPr>
+              <w:t>Promt 25 – Habilitar la eliminación del anfitrión</w:t>
+            </w:r>
+            <w:r>
+              <w:rPr>
+                <w:noProof/>
+                <w:webHidden/>
+              </w:rPr>
+              <w:tab/>
+            </w:r>
+            <w:r>
+              <w:rPr>
+                <w:noProof/>
+                <w:webHidden/>
+              </w:rPr>
+              <w:fldChar w:fldCharType="begin"/>
+            </w:r>
+            <w:r>
+              <w:rPr>
+                <w:noProof/>
+                <w:webHidden/>
+              </w:rPr>
+              <w:instrText xml:space="preserve"> PAGEREF _Toc227660537 \h </w:instrText>
+            </w:r>
+            <w:r>
+              <w:rPr>
+                <w:noProof/>
+                <w:webHidden/>
+              </w:rPr>
+            </w:r>
+            <w:r>
+              <w:rPr>
+                <w:noProof/>
+                <w:webHidden/>
+              </w:rPr>
+              <w:fldChar w:fldCharType="separate"/>
+            </w:r>
+            <w:r>
+              <w:rPr>
+                <w:noProof/>
+                <w:webHidden/>
+              </w:rPr>
+              <w:t>17</w:t>
+            </w:r>
+            <w:r>
+              <w:rPr>
+                <w:noProof/>
+                <w:webHidden/>
+              </w:rPr>
+              <w:fldChar w:fldCharType="end"/>
+            </w:r>
+          </w:hyperlink>
+        </w:p>
+        <w:p>
+          <w:pPr>
+            <w:pStyle w:val="TDC1"/>
+            <w:tabs>
+              <w:tab w:val="right" w:leader="dot" w:pos="8494"/>
+            </w:tabs>
+            <w:rPr>
+              <w:noProof/>
+            </w:rPr>
+          </w:pPr>
+          <w:hyperlink w:anchor="_Toc227660538" w:history="1">
+            <w:r>
+              <w:rPr>
+                <w:rStyle w:val="Hipervnculo"/>
+                <w:noProof/>
+              </w:rPr>
+              <w:t>Promt 26 – Arreglar los tipos de los juegos de mesa</w:t>
+            </w:r>
+            <w:r>
+              <w:rPr>
+                <w:noProof/>
+                <w:webHidden/>
+              </w:rPr>
+              <w:tab/>
+            </w:r>
+            <w:r>
+              <w:rPr>
+                <w:noProof/>
+                <w:webHidden/>
+              </w:rPr>
+              <w:fldChar w:fldCharType="begin"/>
+            </w:r>
+            <w:r>
+              <w:rPr>
+                <w:noProof/>
+                <w:webHidden/>
+              </w:rPr>
+              <w:instrText xml:space="preserve"> PAGEREF _Toc227660538 \h </w:instrText>
+            </w:r>
+            <w:r>
+              <w:rPr>
+                <w:noProof/>
+                <w:webHidden/>
+              </w:rPr>
+            </w:r>
+            <w:r>
+              <w:rPr>
+                <w:noProof/>
+                <w:webHidden/>
+              </w:rPr>
+              <w:fldChar w:fldCharType="separate"/>
+            </w:r>
+            <w:r>
+              <w:rPr>
+                <w:noProof/>
+                <w:webHidden/>
+              </w:rPr>
+              <w:t>17</w:t>
             </w:r>
             <w:r>
               <w:rPr>
@@ -511,7 +1925,7 @@
       <w:pPr>
         <w:pStyle w:val="Ttulo1"/>
       </w:pPr>
-      <w:bookmarkStart w:id="0" w:name="_Toc227152366"/>
+      <w:bookmarkStart w:id="0" w:name="_Toc227660513"/>
       <w:proofErr w:type="spellStart"/>
       <w:r>
         <w:lastRenderedPageBreak/>
@@ -8061,7 +9475,7 @@
       <w:pPr>
         <w:pStyle w:val="Ttulo1"/>
       </w:pPr>
-      <w:bookmarkStart w:id="1" w:name="_Toc227152367"/>
+      <w:bookmarkStart w:id="1" w:name="_Toc227660514"/>
       <w:proofErr w:type="spellStart"/>
       <w:r>
         <w:t>Promt</w:t>
@@ -11215,7 +12629,7 @@
       <w:pPr>
         <w:pStyle w:val="Ttulo1"/>
       </w:pPr>
-      <w:bookmarkStart w:id="2" w:name="_Toc227152368"/>
+      <w:bookmarkStart w:id="2" w:name="_Toc227660515"/>
       <w:proofErr w:type="spellStart"/>
       <w:r>
         <w:t>Promt</w:t>
@@ -11422,7 +12836,7 @@
       <w:pPr>
         <w:pStyle w:val="Ttulo1"/>
       </w:pPr>
-      <w:bookmarkStart w:id="3" w:name="_Toc227152369"/>
+      <w:bookmarkStart w:id="3" w:name="_Toc227660516"/>
       <w:proofErr w:type="spellStart"/>
       <w:r>
         <w:t>Promt</w:t>
@@ -11434,21 +12848,21 @@
       <w:r>
         <w:t>–</w:t>
       </w:r>
+      <w:r>
+        <w:t xml:space="preserve"> </w:t>
+      </w:r>
+      <w:r>
+        <w:t xml:space="preserve">Creando página </w:t>
+      </w:r>
+      <w:proofErr w:type="spellStart"/>
+      <w:r>
+        <w:t>crud</w:t>
+      </w:r>
+      <w:proofErr w:type="spellEnd"/>
+      <w:r>
+        <w:t xml:space="preserve"> juegos de mesa</w:t>
+      </w:r>
       <w:bookmarkEnd w:id="3"/>
-      <w:r>
-        <w:t xml:space="preserve"> </w:t>
-      </w:r>
-      <w:r>
-        <w:t xml:space="preserve">Creando página </w:t>
-      </w:r>
-      <w:proofErr w:type="spellStart"/>
-      <w:r>
-        <w:t>crud</w:t>
-      </w:r>
-      <w:proofErr w:type="spellEnd"/>
-      <w:r>
-        <w:t xml:space="preserve"> juegos de mesa</w:t>
-      </w:r>
     </w:p>
     <w:p>
       <w:r>
@@ -11541,29 +12955,1888 @@
       <w:pPr>
         <w:pStyle w:val="Ttulo1"/>
       </w:pPr>
-      <w:bookmarkStart w:id="4" w:name="_Toc227152370"/>
+      <w:bookmarkStart w:id="4" w:name="_Toc227660517"/>
       <w:proofErr w:type="spellStart"/>
       <w:r>
         <w:t>Promt</w:t>
       </w:r>
       <w:proofErr w:type="spellEnd"/>
       <w:r>
-        <w:t xml:space="preserve"> 5 -</w:t>
+        <w:t xml:space="preserve"> 5 </w:t>
+      </w:r>
+      <w:r>
+        <w:t>–</w:t>
+      </w:r>
+      <w:r>
+        <w:t xml:space="preserve"> </w:t>
+      </w:r>
+      <w:r>
+        <w:t xml:space="preserve">Retocando </w:t>
+      </w:r>
+      <w:proofErr w:type="spellStart"/>
+      <w:r>
+        <w:t>crud</w:t>
+      </w:r>
+      <w:proofErr w:type="spellEnd"/>
+      <w:r>
+        <w:t xml:space="preserve">, propietario y </w:t>
+      </w:r>
+      <w:proofErr w:type="spellStart"/>
+      <w:r>
+        <w:t>slug</w:t>
       </w:r>
       <w:bookmarkEnd w:id="4"/>
+      <w:proofErr w:type="spellEnd"/>
+    </w:p>
+    <w:p>
+      <w:r>
+        <w:t xml:space="preserve">Me ha gustado lo que has hecho con el </w:t>
+      </w:r>
+      <w:proofErr w:type="spellStart"/>
+      <w:r>
+        <w:t>crud</w:t>
+      </w:r>
+      <w:proofErr w:type="spellEnd"/>
+      <w:r>
+        <w:t xml:space="preserve"> de los juegos de mesa, pero hay un par de puntos a retocar. Ni en las fichas de los juegos en la ludoteca ni en las fichas una vez entras en cada juego, me muestras el campo propietario (</w:t>
+      </w:r>
+      <w:proofErr w:type="spellStart"/>
+      <w:r>
+        <w:t>owner_user_id</w:t>
+      </w:r>
+      <w:proofErr w:type="spellEnd"/>
+      <w:r>
+        <w:t xml:space="preserve">), este campo contendrá 0 si el propietario es el club, y por lo tanto deberá mostrarse como propietario “ZAS”, o contendrá el id del usuario propietario del juego. En este caso deberá indicar el </w:t>
+      </w:r>
+      <w:proofErr w:type="spellStart"/>
+      <w:r>
+        <w:t>nickname</w:t>
+      </w:r>
+      <w:proofErr w:type="spellEnd"/>
+      <w:r>
+        <w:t xml:space="preserve"> del usuario. Por otro lado, cuando editamos un juego, no nos aparece el campo </w:t>
+      </w:r>
+      <w:proofErr w:type="spellStart"/>
+      <w:r>
+        <w:t>slug</w:t>
+      </w:r>
+      <w:proofErr w:type="spellEnd"/>
+      <w:r>
+        <w:t xml:space="preserve"> (correcto), pero este campo se deberá actualizar con el nombre del juego, pero cambiando los espacios por guiones “-“. Además, en la URL no debe aparecer el numero de id del juego, sino el </w:t>
+      </w:r>
+      <w:proofErr w:type="spellStart"/>
+      <w:r>
+        <w:t>slug</w:t>
+      </w:r>
+      <w:proofErr w:type="spellEnd"/>
+      <w:r>
+        <w:t xml:space="preserve"> de ese juego. Por último, en la edición que has creado, no se pueden añadir ni quitar los tipos de juegos. </w:t>
+      </w:r>
+      <w:proofErr w:type="spellStart"/>
+      <w:r>
+        <w:t>Deberian</w:t>
+      </w:r>
+      <w:proofErr w:type="spellEnd"/>
+      <w:r>
+        <w:t xml:space="preserve"> haber 2 columnas, la de la izquierda con todos los tipos de juegos disponibles (tabla </w:t>
+      </w:r>
+      <w:proofErr w:type="spellStart"/>
+      <w:r>
+        <w:t>types</w:t>
+      </w:r>
+      <w:proofErr w:type="spellEnd"/>
+      <w:r>
+        <w:t>) y en la derecha a los que pertenece este juego, pudiendo añadir y quitar tipos al juego.</w:t>
+      </w:r>
+    </w:p>
+    <w:p>
+      <w:pPr>
+        <w:pStyle w:val="Ttulo1"/>
+      </w:pPr>
+      <w:bookmarkStart w:id="5" w:name="_Toc227660518"/>
+      <w:proofErr w:type="spellStart"/>
+      <w:r>
+        <w:t>Promt</w:t>
+      </w:r>
+      <w:proofErr w:type="spellEnd"/>
+      <w:r>
+        <w:t xml:space="preserve"> 6 </w:t>
+      </w:r>
+      <w:r>
+        <w:t>–</w:t>
+      </w:r>
       <w:r>
         <w:t xml:space="preserve"> </w:t>
       </w:r>
-    </w:p>
-    <w:p>
-      <w:pPr>
-        <w:rPr>
-          <w:u w:val="single"/>
-        </w:rPr>
-      </w:pPr>
+      <w:r>
+        <w:t>R</w:t>
+      </w:r>
+      <w:r>
+        <w:t>etrocediendo por API</w:t>
+      </w:r>
+      <w:bookmarkEnd w:id="5"/>
+    </w:p>
+    <w:p>
+      <w:r>
+        <w:t xml:space="preserve">Dejemos la </w:t>
+      </w:r>
+      <w:proofErr w:type="spellStart"/>
+      <w:r>
+        <w:t>url</w:t>
+      </w:r>
+      <w:proofErr w:type="spellEnd"/>
+      <w:r>
+        <w:t xml:space="preserve"> del juego con id, ya que la API no está adaptada para que encuentre el juego por </w:t>
+      </w:r>
+      <w:proofErr w:type="spellStart"/>
+      <w:r>
+        <w:t>slug</w:t>
+      </w:r>
+      <w:proofErr w:type="spellEnd"/>
+      <w:r>
+        <w:t>.</w:t>
+      </w:r>
+    </w:p>
+    <w:p>
+      <w:pPr>
+        <w:pStyle w:val="Ttulo1"/>
+      </w:pPr>
+      <w:bookmarkStart w:id="6" w:name="_Toc227660519"/>
+      <w:proofErr w:type="spellStart"/>
+      <w:r>
+        <w:t>Promt</w:t>
+      </w:r>
+      <w:proofErr w:type="spellEnd"/>
+      <w:r>
+        <w:t xml:space="preserve"> 7 </w:t>
+      </w:r>
+      <w:r>
+        <w:t>–</w:t>
+      </w:r>
+      <w:r>
+        <w:t xml:space="preserve"> </w:t>
+      </w:r>
+      <w:proofErr w:type="spellStart"/>
+      <w:r>
+        <w:t>Crud</w:t>
+      </w:r>
+      <w:proofErr w:type="spellEnd"/>
+      <w:r>
+        <w:t xml:space="preserve"> </w:t>
+      </w:r>
+      <w:proofErr w:type="spellStart"/>
+      <w:r>
+        <w:t>types</w:t>
+      </w:r>
+      <w:bookmarkEnd w:id="6"/>
+      <w:proofErr w:type="spellEnd"/>
+    </w:p>
+    <w:p>
+      <w:pPr>
+        <w:pStyle w:val="NormalWeb"/>
+      </w:pPr>
+      <w:r>
+        <w:t xml:space="preserve">Ahora vamos a crear el </w:t>
+      </w:r>
+      <w:proofErr w:type="spellStart"/>
+      <w:r>
+        <w:t>crud</w:t>
+      </w:r>
+      <w:proofErr w:type="spellEnd"/>
+      <w:r>
+        <w:t xml:space="preserve"> de los tipos de juegos. Debe funcionar igual que el </w:t>
+      </w:r>
+      <w:proofErr w:type="spellStart"/>
+      <w:r>
+        <w:t>crud</w:t>
+      </w:r>
+      <w:proofErr w:type="spellEnd"/>
+      <w:r>
+        <w:t xml:space="preserve"> de juegos de mesa (página inicial con </w:t>
+      </w:r>
+      <w:proofErr w:type="spellStart"/>
+      <w:r>
+        <w:t>cards</w:t>
+      </w:r>
+      <w:proofErr w:type="spellEnd"/>
+      <w:r>
+        <w:t xml:space="preserve"> de todos los tipos, página de detalle del tipo, y página de edición), solo que aquí utilizamos la tabla </w:t>
+      </w:r>
+      <w:proofErr w:type="spellStart"/>
+      <w:r>
+        <w:t>types</w:t>
+      </w:r>
+      <w:proofErr w:type="spellEnd"/>
+      <w:r>
+        <w:t xml:space="preserve"> y solo tenemos los campos id, </w:t>
+      </w:r>
+      <w:proofErr w:type="spellStart"/>
+      <w:r>
+        <w:t>type</w:t>
+      </w:r>
+      <w:proofErr w:type="spellEnd"/>
+      <w:r>
+        <w:t xml:space="preserve"> y descripción.</w:t>
+      </w:r>
     </w:p>
     <w:p/>
+    <w:p>
+      <w:pPr>
+        <w:pStyle w:val="Ttulo1"/>
+      </w:pPr>
+      <w:bookmarkStart w:id="7" w:name="_Toc227660520"/>
+      <w:proofErr w:type="spellStart"/>
+      <w:r>
+        <w:lastRenderedPageBreak/>
+        <w:t>Promt</w:t>
+      </w:r>
+      <w:proofErr w:type="spellEnd"/>
+      <w:r>
+        <w:t xml:space="preserve"> 8 </w:t>
+      </w:r>
+      <w:r>
+        <w:t>–</w:t>
+      </w:r>
+      <w:r>
+        <w:t xml:space="preserve"> </w:t>
+      </w:r>
+      <w:proofErr w:type="spellStart"/>
+      <w:r>
+        <w:t>Profile</w:t>
+      </w:r>
+      <w:proofErr w:type="spellEnd"/>
+      <w:r>
+        <w:t xml:space="preserve"> page</w:t>
+      </w:r>
+      <w:bookmarkEnd w:id="7"/>
+    </w:p>
+    <w:p>
+      <w:pPr>
+        <w:pStyle w:val="NormalWeb"/>
+      </w:pPr>
+      <w:r>
+        <w:t xml:space="preserve">Ahora vamos a crear la página para el perfil. En esta nueva página habrá un formulario con los datos del perfil del usuario activo (nombre, </w:t>
+      </w:r>
+      <w:proofErr w:type="spellStart"/>
+      <w:r>
+        <w:t>nickname</w:t>
+      </w:r>
+      <w:proofErr w:type="spellEnd"/>
+      <w:r>
+        <w:t xml:space="preserve">, email, contraseña (requerirá confirmación) tipo de usuario, número de socio Teléfono, edad). Los usuarios podrán actualizar estos campos. </w:t>
+      </w:r>
+      <w:proofErr w:type="spellStart"/>
+      <w:r>
+        <w:t>Ademas</w:t>
+      </w:r>
+      <w:proofErr w:type="spellEnd"/>
+      <w:r>
+        <w:t xml:space="preserve">, si eres de perfil administrador, al principio de todo te saldrá un </w:t>
+      </w:r>
+      <w:proofErr w:type="spellStart"/>
+      <w:r>
+        <w:t>select</w:t>
+      </w:r>
+      <w:proofErr w:type="spellEnd"/>
+      <w:r>
+        <w:t xml:space="preserve"> con todos los usuarios (nombre y </w:t>
+      </w:r>
+      <w:proofErr w:type="spellStart"/>
+      <w:r>
+        <w:t>nickname</w:t>
+      </w:r>
+      <w:proofErr w:type="spellEnd"/>
+      <w:r>
+        <w:t xml:space="preserve">) y también saldrá otro </w:t>
+      </w:r>
+      <w:proofErr w:type="spellStart"/>
+      <w:r>
+        <w:t>select</w:t>
+      </w:r>
+      <w:proofErr w:type="spellEnd"/>
+      <w:r>
+        <w:t xml:space="preserve"> con el tipo de </w:t>
+      </w:r>
+      <w:proofErr w:type="spellStart"/>
+      <w:r>
+        <w:t>usario</w:t>
+      </w:r>
+      <w:proofErr w:type="spellEnd"/>
+      <w:r>
+        <w:t>. De esta manera, el/los administradores podrán actualizar los datos de su perfil o los de cualquier otro usuario. El resto de usuarios solo podrán ver y actualizar los datos de su usuario.</w:t>
+      </w:r>
+    </w:p>
     <w:p/>
+    <w:p>
+      <w:pPr>
+        <w:pStyle w:val="Ttulo1"/>
+      </w:pPr>
+      <w:bookmarkStart w:id="8" w:name="_Toc227660521"/>
+      <w:proofErr w:type="spellStart"/>
+      <w:r>
+        <w:t>Promt</w:t>
+      </w:r>
+      <w:proofErr w:type="spellEnd"/>
+      <w:r>
+        <w:t xml:space="preserve"> 9 </w:t>
+      </w:r>
+      <w:r>
+        <w:t>–</w:t>
+      </w:r>
+      <w:r>
+        <w:t xml:space="preserve"> </w:t>
+      </w:r>
+      <w:r>
+        <w:t xml:space="preserve">Retocando </w:t>
+      </w:r>
+      <w:proofErr w:type="spellStart"/>
+      <w:r>
+        <w:t>profile</w:t>
+      </w:r>
+      <w:bookmarkEnd w:id="8"/>
+      <w:proofErr w:type="spellEnd"/>
+    </w:p>
+    <w:p>
+      <w:pPr>
+        <w:pStyle w:val="NormalWeb"/>
+      </w:pPr>
+      <w:r>
+        <w:t xml:space="preserve">En la página del perfil que has creado, has añadido un </w:t>
+      </w:r>
+      <w:proofErr w:type="spellStart"/>
+      <w:r>
+        <w:t>div</w:t>
+      </w:r>
+      <w:proofErr w:type="spellEnd"/>
+      <w:r>
+        <w:t xml:space="preserve"> </w:t>
+      </w:r>
+      <w:proofErr w:type="spellStart"/>
+      <w:r>
+        <w:t>class</w:t>
+      </w:r>
+      <w:proofErr w:type="spellEnd"/>
+      <w:r>
+        <w:t>=”</w:t>
+      </w:r>
+      <w:proofErr w:type="spellStart"/>
+      <w:r>
+        <w:t>profile</w:t>
+      </w:r>
+      <w:proofErr w:type="spellEnd"/>
+      <w:r>
+        <w:t>-avatar” con un color de fondo que no me gusta. Quítalo por favor. Además, cuando cambio de tipo de perfil a un usuario, me funciona bien salvo cuando le intento cambiar a tipo “junta”. Puedes comprobar que este todo correcto. Por último, en la petición que te he hecho antes, no me has indicado que también habías modificado el fichero App.jsx. ¿Cambiaste alguno más que no me indicaras?</w:t>
+      </w:r>
+    </w:p>
+    <w:p/>
+    <w:p>
+      <w:pPr>
+        <w:pStyle w:val="Ttulo1"/>
+      </w:pPr>
+      <w:bookmarkStart w:id="9" w:name="_Toc227660522"/>
+      <w:proofErr w:type="spellStart"/>
+      <w:r>
+        <w:t>Promt</w:t>
+      </w:r>
+      <w:proofErr w:type="spellEnd"/>
+      <w:r>
+        <w:t xml:space="preserve"> 10 </w:t>
+      </w:r>
+      <w:r>
+        <w:t>–</w:t>
+      </w:r>
+      <w:r>
+        <w:t xml:space="preserve"> </w:t>
+      </w:r>
+      <w:r>
+        <w:t>Aclarando estilos con la IA</w:t>
+      </w:r>
+      <w:bookmarkEnd w:id="9"/>
+    </w:p>
+    <w:p>
+      <w:pPr>
+        <w:pStyle w:val="NormalWeb"/>
+      </w:pPr>
+      <w:proofErr w:type="gramStart"/>
+      <w:r>
+        <w:t>vale</w:t>
+      </w:r>
+      <w:proofErr w:type="gramEnd"/>
+      <w:r>
+        <w:t xml:space="preserve">, ahora veo el problema. Como antes no me </w:t>
+      </w:r>
+      <w:proofErr w:type="spellStart"/>
+      <w:r>
+        <w:t>habias</w:t>
+      </w:r>
+      <w:proofErr w:type="spellEnd"/>
+      <w:r>
+        <w:t xml:space="preserve"> indicado que </w:t>
+      </w:r>
+      <w:proofErr w:type="spellStart"/>
+      <w:r>
+        <w:t>habias</w:t>
+      </w:r>
+      <w:proofErr w:type="spellEnd"/>
+      <w:r>
+        <w:t xml:space="preserve"> cambiado el fichero index.css, no lo </w:t>
+      </w:r>
+      <w:proofErr w:type="spellStart"/>
+      <w:r>
+        <w:t>habia</w:t>
+      </w:r>
+      <w:proofErr w:type="spellEnd"/>
+      <w:r>
+        <w:t xml:space="preserve"> actualizado y por eso se </w:t>
+      </w:r>
+      <w:proofErr w:type="spellStart"/>
+      <w:r>
+        <w:t>veia</w:t>
+      </w:r>
+      <w:proofErr w:type="spellEnd"/>
+      <w:r>
+        <w:t xml:space="preserve"> mal el &lt;</w:t>
+      </w:r>
+      <w:proofErr w:type="spellStart"/>
+      <w:r>
+        <w:t>div</w:t>
+      </w:r>
+      <w:proofErr w:type="spellEnd"/>
+      <w:r>
+        <w:t xml:space="preserve"> </w:t>
+      </w:r>
+      <w:proofErr w:type="spellStart"/>
+      <w:r>
+        <w:t>class</w:t>
+      </w:r>
+      <w:proofErr w:type="spellEnd"/>
+      <w:r>
+        <w:t>="</w:t>
+      </w:r>
+      <w:proofErr w:type="spellStart"/>
+      <w:r>
+        <w:t>profile</w:t>
+      </w:r>
+      <w:proofErr w:type="spellEnd"/>
+      <w:r>
+        <w:t xml:space="preserve">-avatar"&gt;. Ya </w:t>
+      </w:r>
+      <w:proofErr w:type="spellStart"/>
+      <w:r>
+        <w:t>esta</w:t>
+      </w:r>
+      <w:proofErr w:type="spellEnd"/>
+      <w:r>
+        <w:t xml:space="preserve"> bien como lo </w:t>
+      </w:r>
+      <w:proofErr w:type="spellStart"/>
+      <w:r>
+        <w:t>habias</w:t>
+      </w:r>
+      <w:proofErr w:type="spellEnd"/>
+      <w:r>
+        <w:t xml:space="preserve"> hecho. Pero no me hagas nada, solo ten en cuenta que usaré el index.css de la versión 8</w:t>
+      </w:r>
+    </w:p>
+    <w:p/>
+    <w:p>
+      <w:pPr>
+        <w:pStyle w:val="Ttulo1"/>
+      </w:pPr>
+      <w:bookmarkStart w:id="10" w:name="_Toc227660523"/>
+      <w:proofErr w:type="spellStart"/>
+      <w:r>
+        <w:t>Promt</w:t>
+      </w:r>
+      <w:proofErr w:type="spellEnd"/>
+      <w:r>
+        <w:t xml:space="preserve"> 11 </w:t>
+      </w:r>
+      <w:r>
+        <w:t>–</w:t>
+      </w:r>
+      <w:r>
+        <w:t xml:space="preserve"> </w:t>
+      </w:r>
+      <w:r>
+        <w:t xml:space="preserve">Actualizando </w:t>
+      </w:r>
+      <w:proofErr w:type="spellStart"/>
+      <w:r>
+        <w:t>navbar</w:t>
+      </w:r>
+      <w:bookmarkEnd w:id="10"/>
+      <w:proofErr w:type="spellEnd"/>
+    </w:p>
+    <w:p>
+      <w:pPr>
+        <w:pStyle w:val="NormalWeb"/>
+      </w:pPr>
+      <w:r>
+        <w:t xml:space="preserve">Bien, como hemos hecho que dentro de la opción perfil se pueda cambiar la contraseña, podemos eliminar del </w:t>
+      </w:r>
+      <w:proofErr w:type="spellStart"/>
+      <w:r>
+        <w:t>navbar</w:t>
+      </w:r>
+      <w:proofErr w:type="spellEnd"/>
+      <w:r>
+        <w:t xml:space="preserve"> la opción de cambiar contraseña. </w:t>
+      </w:r>
+      <w:proofErr w:type="spellStart"/>
+      <w:r>
+        <w:t>Creame</w:t>
+      </w:r>
+      <w:proofErr w:type="spellEnd"/>
+      <w:r>
+        <w:t xml:space="preserve"> únicamente los ficheros necesarios sin </w:t>
+      </w:r>
+      <w:proofErr w:type="spellStart"/>
+      <w:r>
+        <w:t>zip</w:t>
+      </w:r>
+      <w:proofErr w:type="spellEnd"/>
+    </w:p>
+    <w:p/>
+    <w:p>
+      <w:pPr>
+        <w:pStyle w:val="Ttulo1"/>
+      </w:pPr>
+      <w:bookmarkStart w:id="11" w:name="_Toc227660524"/>
+      <w:proofErr w:type="spellStart"/>
+      <w:r>
+        <w:t>Promt</w:t>
+      </w:r>
+      <w:proofErr w:type="spellEnd"/>
+      <w:r>
+        <w:t xml:space="preserve"> 12 </w:t>
+      </w:r>
+      <w:r>
+        <w:t>–</w:t>
+      </w:r>
+      <w:r>
+        <w:t xml:space="preserve"> </w:t>
+      </w:r>
+      <w:proofErr w:type="spellStart"/>
+      <w:r>
+        <w:t>Crud</w:t>
+      </w:r>
+      <w:proofErr w:type="spellEnd"/>
+      <w:r>
+        <w:t xml:space="preserve"> sesiones</w:t>
+      </w:r>
+      <w:bookmarkEnd w:id="11"/>
+    </w:p>
+    <w:p>
+      <w:pPr>
+        <w:pStyle w:val="NormalWeb"/>
+      </w:pPr>
+      <w:r>
+        <w:t xml:space="preserve">Genial, ahora vamos a por las últimas páginas, aunque también las más complicadas. En la inicial tiene que tener un botón para crear sesiones, y después mostramos </w:t>
+      </w:r>
+      <w:proofErr w:type="spellStart"/>
+      <w:r>
+        <w:t>cards</w:t>
+      </w:r>
+      <w:proofErr w:type="spellEnd"/>
+      <w:r>
+        <w:t xml:space="preserve"> con </w:t>
+      </w:r>
+      <w:r>
+        <w:lastRenderedPageBreak/>
+        <w:t xml:space="preserve">las sesiones futuras en orden ascendente (incluida la de hoy aunque la hora ya haya empezado). Tiene que haber, eso sí, un </w:t>
+      </w:r>
+      <w:proofErr w:type="spellStart"/>
+      <w:r>
+        <w:t>checkbox</w:t>
+      </w:r>
+      <w:proofErr w:type="spellEnd"/>
+      <w:r>
+        <w:t xml:space="preserve"> para poder ver también sesiones pasadas. El estilo tiene que ser como el de las páginas de juegos de mesa y de tipos. Una vez entramos en la ficha de una sesión, además de los datos de esa sesión se tienen que ver los usuarios apuntados y las partidas creadas en esa sesión. Por último, de cada partida creada se debe ver el nombre del juego, la hora de inicio, el número de jugadores apuntas y máximo, quien ha creado la partida (nombre), si la partida está cerrada y el resto de jugadores apuntados. También debe haber además de los botones de volver, editar y borrar, los botones de apuntarse y borrarse de la sesión, y un último botón (para todos los usuarios salvo para </w:t>
+      </w:r>
+      <w:proofErr w:type="spellStart"/>
+      <w:r>
+        <w:t>guest</w:t>
+      </w:r>
+      <w:proofErr w:type="spellEnd"/>
+      <w:r>
+        <w:t>), de crear partida</w:t>
+      </w:r>
+    </w:p>
+    <w:p/>
+    <w:p>
+      <w:pPr>
+        <w:pStyle w:val="Ttulo1"/>
+      </w:pPr>
+      <w:bookmarkStart w:id="12" w:name="_Toc227660525"/>
+      <w:proofErr w:type="spellStart"/>
+      <w:r>
+        <w:t>Promt</w:t>
+      </w:r>
+      <w:proofErr w:type="spellEnd"/>
+      <w:r>
+        <w:t xml:space="preserve"> 13 </w:t>
+      </w:r>
+      <w:r>
+        <w:t>–</w:t>
+      </w:r>
+      <w:r>
+        <w:t xml:space="preserve"> </w:t>
+      </w:r>
+      <w:r>
+        <w:t>Arreglar formato hora</w:t>
+      </w:r>
+      <w:bookmarkEnd w:id="12"/>
+    </w:p>
+    <w:p>
+      <w:pPr>
+        <w:pStyle w:val="NormalWeb"/>
+      </w:pPr>
+      <w:r>
+        <w:t>Hay que retocar 2 cosas. Cuando intento crear una partida, no me deja ya que me indica que el formato de la hora no es correcto “</w:t>
+      </w:r>
+      <w:proofErr w:type="spellStart"/>
+      <w:r>
+        <w:t>The</w:t>
+      </w:r>
+      <w:proofErr w:type="spellEnd"/>
+      <w:r>
+        <w:t xml:space="preserve"> </w:t>
+      </w:r>
+      <w:proofErr w:type="spellStart"/>
+      <w:r>
+        <w:t>start</w:t>
+      </w:r>
+      <w:proofErr w:type="spellEnd"/>
+      <w:r>
+        <w:t xml:space="preserve"> time </w:t>
+      </w:r>
+      <w:proofErr w:type="spellStart"/>
+      <w:r>
+        <w:t>field</w:t>
+      </w:r>
+      <w:proofErr w:type="spellEnd"/>
+      <w:r>
+        <w:t xml:space="preserve"> </w:t>
+      </w:r>
+      <w:proofErr w:type="spellStart"/>
+      <w:r>
+        <w:t>must</w:t>
+      </w:r>
+      <w:proofErr w:type="spellEnd"/>
+      <w:r>
+        <w:t xml:space="preserve"> match </w:t>
+      </w:r>
+      <w:proofErr w:type="spellStart"/>
+      <w:r>
+        <w:t>the</w:t>
+      </w:r>
+      <w:proofErr w:type="spellEnd"/>
+      <w:r>
+        <w:t xml:space="preserve"> </w:t>
+      </w:r>
+      <w:proofErr w:type="spellStart"/>
+      <w:r>
+        <w:t>format</w:t>
+      </w:r>
+      <w:proofErr w:type="spellEnd"/>
+      <w:r>
+        <w:t xml:space="preserve"> H</w:t>
+      </w:r>
+      <w:proofErr w:type="gramStart"/>
+      <w:r>
+        <w:t>:i:s</w:t>
+      </w:r>
+      <w:proofErr w:type="gramEnd"/>
+      <w:r>
+        <w:t>.”. El problema es que el componente que muestra no deja indicar los segundos solo horas y minutos. Se puede solucionar poniendo que los segundos siempre son “00”</w:t>
+      </w:r>
+      <w:proofErr w:type="gramStart"/>
+      <w:r>
+        <w:t>?</w:t>
+      </w:r>
+      <w:proofErr w:type="gramEnd"/>
+      <w:r>
+        <w:t xml:space="preserve"> Además, sería recomendable que se viera el horario de la sesión, dejando solo poner horas dentro de ese horario. Por otro lado, para las 2 partidas que ya hay creadas, hay jugadores apuntados (tabla </w:t>
+      </w:r>
+      <w:proofErr w:type="spellStart"/>
+      <w:r>
+        <w:t>game_user</w:t>
+      </w:r>
+      <w:proofErr w:type="spellEnd"/>
+      <w:r>
+        <w:t>), pero no aparece ningún jugador apuntado. ¿Puedes comprobar que esté todo correcto?</w:t>
+      </w:r>
+    </w:p>
+    <w:p/>
+    <w:p>
+      <w:pPr>
+        <w:pStyle w:val="Ttulo1"/>
+      </w:pPr>
+      <w:bookmarkStart w:id="13" w:name="_Toc227660526"/>
+      <w:proofErr w:type="spellStart"/>
+      <w:r>
+        <w:t>Promt</w:t>
+      </w:r>
+      <w:proofErr w:type="spellEnd"/>
+      <w:r>
+        <w:t xml:space="preserve"> 14 </w:t>
+      </w:r>
+      <w:r>
+        <w:t>–</w:t>
+      </w:r>
+      <w:r>
+        <w:t xml:space="preserve"> </w:t>
+      </w:r>
+      <w:r>
+        <w:t>Añadiendo limitaciones</w:t>
+      </w:r>
+      <w:bookmarkEnd w:id="13"/>
+    </w:p>
+    <w:p>
+      <w:pPr>
+        <w:pStyle w:val="NormalWeb"/>
+      </w:pPr>
+      <w:r>
+        <w:t>No debe dejar apuntarse a una partida si no se ha apuntado a la sesión (puede hacer que automáticamente, si se apunta a una partida, se apunte a la sesión si queda espacio</w:t>
+      </w:r>
+      <w:proofErr w:type="gramStart"/>
+      <w:r>
+        <w:t>?</w:t>
+      </w:r>
+      <w:proofErr w:type="gramEnd"/>
+      <w:r>
+        <w:t>). Lo mismo para darse de baja de la sesión si está apuntado en alguna partida, pero añadiendo la limitación de que si la partida está en estado de jugando o terminada, el usuario ya no podrá borrarse ni de la partida ni de la sesión. Por último, hay que modificar también la página de inicio para que también se vean los jugadores de las partidas.</w:t>
+      </w:r>
+    </w:p>
+    <w:p/>
+    <w:p>
+      <w:pPr>
+        <w:pStyle w:val="Ttulo1"/>
+      </w:pPr>
+      <w:bookmarkStart w:id="14" w:name="_Toc227660527"/>
+      <w:proofErr w:type="spellStart"/>
+      <w:r>
+        <w:t>Promt</w:t>
+      </w:r>
+      <w:proofErr w:type="spellEnd"/>
+      <w:r>
+        <w:t xml:space="preserve"> 15 </w:t>
+      </w:r>
+      <w:r>
+        <w:t>–</w:t>
+      </w:r>
+      <w:r>
+        <w:t xml:space="preserve"> </w:t>
+      </w:r>
+      <w:r>
+        <w:t xml:space="preserve">Volver a pedir tema </w:t>
+      </w:r>
+      <w:proofErr w:type="spellStart"/>
+      <w:r>
+        <w:t>ovidado</w:t>
+      </w:r>
+      <w:bookmarkEnd w:id="14"/>
+      <w:proofErr w:type="spellEnd"/>
+    </w:p>
+    <w:p>
+      <w:pPr>
+        <w:pStyle w:val="NormalWeb"/>
+      </w:pPr>
+      <w:r>
+        <w:t>No me has actualizado la página de inicio con el tema de los usuarios</w:t>
+      </w:r>
+    </w:p>
+    <w:p/>
+    <w:p>
+      <w:pPr>
+        <w:pStyle w:val="Ttulo1"/>
+      </w:pPr>
+      <w:bookmarkStart w:id="15" w:name="_Toc227660528"/>
+      <w:proofErr w:type="spellStart"/>
+      <w:r>
+        <w:lastRenderedPageBreak/>
+        <w:t>Promt</w:t>
+      </w:r>
+      <w:proofErr w:type="spellEnd"/>
+      <w:r>
+        <w:t xml:space="preserve"> 16 </w:t>
+      </w:r>
+      <w:r>
+        <w:t>–</w:t>
+      </w:r>
+      <w:r>
+        <w:t xml:space="preserve"> </w:t>
+      </w:r>
+      <w:r>
+        <w:t>Cambiar nombre partidas y jugadores</w:t>
+      </w:r>
+      <w:bookmarkEnd w:id="15"/>
+    </w:p>
+    <w:p>
+      <w:pPr>
+        <w:pStyle w:val="NormalWeb"/>
+      </w:pPr>
+      <w:r>
+        <w:t xml:space="preserve">En el listado de partidas de cada sesión, indicas “partida 1”, “partida 2”, </w:t>
+      </w:r>
+      <w:proofErr w:type="spellStart"/>
+      <w:r>
+        <w:t>etc</w:t>
+      </w:r>
+      <w:proofErr w:type="spellEnd"/>
+      <w:r>
+        <w:t xml:space="preserve"> en lugar de indicar el nombre del juego. Recuerda que las partidas tienes que obtenerlas de la tabla “</w:t>
+      </w:r>
+      <w:proofErr w:type="spellStart"/>
+      <w:r>
+        <w:t>games</w:t>
+      </w:r>
+      <w:proofErr w:type="spellEnd"/>
+      <w:r>
+        <w:t xml:space="preserve">”, donde identificas la id de la sesión con el campo </w:t>
+      </w:r>
+      <w:proofErr w:type="spellStart"/>
+      <w:r>
+        <w:t>zassession_id</w:t>
+      </w:r>
+      <w:proofErr w:type="spellEnd"/>
+      <w:r>
+        <w:t xml:space="preserve">, y el juego con el campo </w:t>
+      </w:r>
+      <w:proofErr w:type="spellStart"/>
+      <w:r>
+        <w:t>boardgame_id</w:t>
+      </w:r>
+      <w:proofErr w:type="spellEnd"/>
+      <w:r>
+        <w:t xml:space="preserve">, y a partir del id del juego, puedes ir a la tabla de </w:t>
+      </w:r>
+      <w:proofErr w:type="spellStart"/>
+      <w:r>
+        <w:t>boardgames</w:t>
+      </w:r>
+      <w:proofErr w:type="spellEnd"/>
+      <w:r>
+        <w:t xml:space="preserve"> para obtener el nombre del juego del campo </w:t>
+      </w:r>
+      <w:proofErr w:type="spellStart"/>
+      <w:r>
+        <w:t>name</w:t>
+      </w:r>
+      <w:proofErr w:type="spellEnd"/>
+      <w:r>
+        <w:t xml:space="preserve">. En segundo lugar, en el apartado de </w:t>
+      </w:r>
+      <w:proofErr w:type="spellStart"/>
+      <w:r>
+        <w:t>sesionDetail</w:t>
+      </w:r>
+      <w:proofErr w:type="spellEnd"/>
+      <w:r>
+        <w:t xml:space="preserve"> si que me indicas el nombre de cada jugador en cada partida, pero en la </w:t>
+      </w:r>
+      <w:proofErr w:type="spellStart"/>
+      <w:r>
+        <w:t>homepage</w:t>
+      </w:r>
+      <w:proofErr w:type="spellEnd"/>
+      <w:r>
+        <w:t xml:space="preserve"> no me lo estas indicando. Si estuviéramos en la </w:t>
+      </w:r>
+      <w:proofErr w:type="spellStart"/>
+      <w:r>
+        <w:t>homepage</w:t>
+      </w:r>
+      <w:proofErr w:type="spellEnd"/>
+      <w:r>
+        <w:t xml:space="preserve"> sin </w:t>
+      </w:r>
+      <w:proofErr w:type="spellStart"/>
+      <w:r>
+        <w:t>logearnos</w:t>
+      </w:r>
+      <w:proofErr w:type="spellEnd"/>
+      <w:r>
+        <w:t xml:space="preserve">, lo entiendo, pero cuando estamos en la </w:t>
+      </w:r>
+      <w:proofErr w:type="spellStart"/>
+      <w:r>
+        <w:t>homepage</w:t>
+      </w:r>
+      <w:proofErr w:type="spellEnd"/>
+      <w:r>
+        <w:t xml:space="preserve"> </w:t>
+      </w:r>
+      <w:proofErr w:type="spellStart"/>
+      <w:r>
+        <w:t>logeados</w:t>
+      </w:r>
+      <w:proofErr w:type="spellEnd"/>
+      <w:r>
+        <w:t>, tienes permisos para ver los usuarios de cada partida. Lo puedes arreglar</w:t>
+      </w:r>
+      <w:proofErr w:type="gramStart"/>
+      <w:r>
+        <w:t>?</w:t>
+      </w:r>
+      <w:proofErr w:type="gramEnd"/>
+    </w:p>
+    <w:p/>
+    <w:p>
+      <w:pPr>
+        <w:pStyle w:val="Ttulo1"/>
+      </w:pPr>
+      <w:bookmarkStart w:id="16" w:name="_Toc227660529"/>
+      <w:proofErr w:type="spellStart"/>
+      <w:r>
+        <w:t>Promt</w:t>
+      </w:r>
+      <w:proofErr w:type="spellEnd"/>
+      <w:r>
+        <w:t xml:space="preserve"> 17 </w:t>
+      </w:r>
+      <w:r>
+        <w:t>–</w:t>
+      </w:r>
+      <w:r>
+        <w:t xml:space="preserve"> </w:t>
+      </w:r>
+      <w:r>
+        <w:t>Arreglar registro usuario</w:t>
+      </w:r>
+      <w:bookmarkEnd w:id="16"/>
+    </w:p>
+    <w:p>
+      <w:pPr>
+        <w:pStyle w:val="NormalWeb"/>
+      </w:pPr>
+      <w:r>
+        <w:t xml:space="preserve">Ahora mismo cuando voy a la página de registro de usuario, me pide únicamente, nombre completo, </w:t>
+      </w:r>
+      <w:proofErr w:type="spellStart"/>
+      <w:r>
+        <w:t>nickname</w:t>
+      </w:r>
+      <w:proofErr w:type="spellEnd"/>
+      <w:r>
+        <w:t xml:space="preserve">, email y contraseña. Entonces al guardar da el error: </w:t>
+      </w:r>
+      <w:proofErr w:type="spellStart"/>
+      <w:r>
+        <w:t>The</w:t>
+      </w:r>
+      <w:proofErr w:type="spellEnd"/>
+      <w:r>
+        <w:t xml:space="preserve"> </w:t>
+      </w:r>
+      <w:proofErr w:type="spellStart"/>
+      <w:r>
+        <w:t>num</w:t>
+      </w:r>
+      <w:proofErr w:type="spellEnd"/>
+      <w:r>
+        <w:t xml:space="preserve"> </w:t>
+      </w:r>
+      <w:proofErr w:type="spellStart"/>
+      <w:r>
+        <w:t>partner</w:t>
+      </w:r>
+      <w:proofErr w:type="spellEnd"/>
+      <w:r>
+        <w:t xml:space="preserve"> </w:t>
+      </w:r>
+      <w:proofErr w:type="spellStart"/>
+      <w:r>
+        <w:t>field</w:t>
+      </w:r>
+      <w:proofErr w:type="spellEnd"/>
+      <w:r>
+        <w:t xml:space="preserve"> </w:t>
+      </w:r>
+      <w:proofErr w:type="spellStart"/>
+      <w:r>
+        <w:t>is</w:t>
+      </w:r>
+      <w:proofErr w:type="spellEnd"/>
+      <w:r>
+        <w:t xml:space="preserve"> </w:t>
+      </w:r>
+      <w:proofErr w:type="spellStart"/>
+      <w:r>
+        <w:t>required</w:t>
+      </w:r>
+      <w:proofErr w:type="spellEnd"/>
+      <w:r>
+        <w:t xml:space="preserve">. · </w:t>
+      </w:r>
+      <w:proofErr w:type="spellStart"/>
+      <w:r>
+        <w:t>The</w:t>
+      </w:r>
+      <w:proofErr w:type="spellEnd"/>
+      <w:r>
+        <w:t xml:space="preserve"> </w:t>
+      </w:r>
+      <w:proofErr w:type="spellStart"/>
+      <w:r>
+        <w:t>password</w:t>
+      </w:r>
+      <w:proofErr w:type="spellEnd"/>
+      <w:r>
+        <w:t xml:space="preserve"> </w:t>
+      </w:r>
+      <w:proofErr w:type="spellStart"/>
+      <w:r>
+        <w:t>field</w:t>
+      </w:r>
+      <w:proofErr w:type="spellEnd"/>
+      <w:r>
+        <w:t xml:space="preserve"> </w:t>
+      </w:r>
+      <w:proofErr w:type="spellStart"/>
+      <w:r>
+        <w:t>confirmation</w:t>
+      </w:r>
+      <w:proofErr w:type="spellEnd"/>
+      <w:r>
+        <w:t xml:space="preserve"> </w:t>
+      </w:r>
+      <w:proofErr w:type="spellStart"/>
+      <w:r>
+        <w:t>does</w:t>
+      </w:r>
+      <w:proofErr w:type="spellEnd"/>
+      <w:r>
+        <w:t xml:space="preserve"> </w:t>
+      </w:r>
+      <w:proofErr w:type="spellStart"/>
+      <w:r>
+        <w:t>not</w:t>
+      </w:r>
+      <w:proofErr w:type="spellEnd"/>
+      <w:r>
+        <w:t xml:space="preserve"> match. · </w:t>
+      </w:r>
+      <w:proofErr w:type="spellStart"/>
+      <w:r>
+        <w:t>The</w:t>
+      </w:r>
+      <w:proofErr w:type="spellEnd"/>
+      <w:r>
+        <w:t xml:space="preserve"> </w:t>
+      </w:r>
+      <w:proofErr w:type="spellStart"/>
+      <w:r>
+        <w:t>type</w:t>
+      </w:r>
+      <w:proofErr w:type="spellEnd"/>
+      <w:r>
+        <w:t xml:space="preserve"> </w:t>
+      </w:r>
+      <w:proofErr w:type="spellStart"/>
+      <w:r>
+        <w:t>field</w:t>
+      </w:r>
+      <w:proofErr w:type="spellEnd"/>
+      <w:r>
+        <w:t xml:space="preserve"> </w:t>
+      </w:r>
+      <w:proofErr w:type="spellStart"/>
+      <w:r>
+        <w:t>is</w:t>
+      </w:r>
+      <w:proofErr w:type="spellEnd"/>
+      <w:r>
+        <w:t xml:space="preserve"> </w:t>
+      </w:r>
+      <w:proofErr w:type="spellStart"/>
+      <w:r>
+        <w:t>required</w:t>
+      </w:r>
+      <w:proofErr w:type="spellEnd"/>
+      <w:r>
+        <w:t xml:space="preserve">. · </w:t>
+      </w:r>
+      <w:proofErr w:type="spellStart"/>
+      <w:r>
+        <w:t>The</w:t>
+      </w:r>
+      <w:proofErr w:type="spellEnd"/>
+      <w:r>
+        <w:t xml:space="preserve"> </w:t>
+      </w:r>
+      <w:proofErr w:type="spellStart"/>
+      <w:r>
+        <w:t>registration</w:t>
+      </w:r>
+      <w:proofErr w:type="spellEnd"/>
+      <w:r>
+        <w:t xml:space="preserve"> date </w:t>
+      </w:r>
+      <w:proofErr w:type="spellStart"/>
+      <w:r>
+        <w:t>field</w:t>
+      </w:r>
+      <w:proofErr w:type="spellEnd"/>
+      <w:r>
+        <w:t xml:space="preserve"> </w:t>
+      </w:r>
+      <w:proofErr w:type="spellStart"/>
+      <w:r>
+        <w:t>is</w:t>
+      </w:r>
+      <w:proofErr w:type="spellEnd"/>
+      <w:r>
+        <w:t xml:space="preserve"> </w:t>
+      </w:r>
+      <w:proofErr w:type="spellStart"/>
+      <w:r>
+        <w:t>required</w:t>
+      </w:r>
+      <w:proofErr w:type="spellEnd"/>
+      <w:r>
+        <w:t xml:space="preserve">. · </w:t>
+      </w:r>
+      <w:proofErr w:type="spellStart"/>
+      <w:r>
+        <w:t>The</w:t>
+      </w:r>
+      <w:proofErr w:type="spellEnd"/>
+      <w:r>
+        <w:t xml:space="preserve"> </w:t>
+      </w:r>
+      <w:proofErr w:type="spellStart"/>
+      <w:r>
+        <w:t>age</w:t>
+      </w:r>
+      <w:proofErr w:type="spellEnd"/>
+      <w:r>
+        <w:t xml:space="preserve"> </w:t>
+      </w:r>
+      <w:proofErr w:type="spellStart"/>
+      <w:r>
+        <w:t>field</w:t>
+      </w:r>
+      <w:proofErr w:type="spellEnd"/>
+      <w:r>
+        <w:t xml:space="preserve"> </w:t>
+      </w:r>
+      <w:proofErr w:type="spellStart"/>
+      <w:r>
+        <w:t>is</w:t>
+      </w:r>
+      <w:proofErr w:type="spellEnd"/>
+      <w:r>
+        <w:t xml:space="preserve"> </w:t>
+      </w:r>
+      <w:proofErr w:type="spellStart"/>
+      <w:r>
+        <w:t>required</w:t>
+      </w:r>
+      <w:proofErr w:type="spellEnd"/>
+      <w:r>
+        <w:t xml:space="preserve">. · </w:t>
+      </w:r>
+      <w:proofErr w:type="spellStart"/>
+      <w:r>
+        <w:t>The</w:t>
+      </w:r>
+      <w:proofErr w:type="spellEnd"/>
+      <w:r>
+        <w:t xml:space="preserve"> </w:t>
+      </w:r>
+      <w:proofErr w:type="spellStart"/>
+      <w:r>
+        <w:t>language</w:t>
+      </w:r>
+      <w:proofErr w:type="spellEnd"/>
+      <w:r>
+        <w:t xml:space="preserve"> </w:t>
+      </w:r>
+      <w:proofErr w:type="spellStart"/>
+      <w:r>
+        <w:t>field</w:t>
+      </w:r>
+      <w:proofErr w:type="spellEnd"/>
+      <w:r>
+        <w:t xml:space="preserve"> </w:t>
+      </w:r>
+      <w:proofErr w:type="spellStart"/>
+      <w:r>
+        <w:t>is</w:t>
+      </w:r>
+      <w:proofErr w:type="spellEnd"/>
+      <w:r>
+        <w:t xml:space="preserve"> </w:t>
+      </w:r>
+      <w:proofErr w:type="spellStart"/>
+      <w:r>
+        <w:t>required</w:t>
+      </w:r>
+      <w:proofErr w:type="spellEnd"/>
+      <w:r>
+        <w:t xml:space="preserve">. Para solucionarlo, debería pedirme también la confirmación del </w:t>
+      </w:r>
+      <w:proofErr w:type="spellStart"/>
+      <w:r>
+        <w:t>password</w:t>
+      </w:r>
+      <w:proofErr w:type="spellEnd"/>
+      <w:r>
+        <w:t xml:space="preserve">, ponerme el campo </w:t>
+      </w:r>
+      <w:proofErr w:type="spellStart"/>
+      <w:r>
+        <w:t>type</w:t>
+      </w:r>
+      <w:proofErr w:type="spellEnd"/>
+      <w:r>
+        <w:t xml:space="preserve"> por defecto a “</w:t>
+      </w:r>
+      <w:proofErr w:type="spellStart"/>
+      <w:r>
+        <w:t>guest</w:t>
+      </w:r>
+      <w:proofErr w:type="spellEnd"/>
+      <w:r>
+        <w:t xml:space="preserve">”, añadir la </w:t>
+      </w:r>
+      <w:proofErr w:type="spellStart"/>
+      <w:r>
+        <w:t>registration_date</w:t>
+      </w:r>
+      <w:proofErr w:type="spellEnd"/>
+      <w:r>
+        <w:t xml:space="preserve"> al </w:t>
+      </w:r>
+      <w:proofErr w:type="spellStart"/>
+      <w:r>
+        <w:t>dia</w:t>
+      </w:r>
+      <w:proofErr w:type="spellEnd"/>
+      <w:r>
+        <w:t xml:space="preserve"> de hoy, poner el lenguaje por defecto a “es, pedir la edad y el teléfono. Por último, debería obtener el último </w:t>
+      </w:r>
+      <w:proofErr w:type="spellStart"/>
+      <w:r>
+        <w:t>num_partner</w:t>
+      </w:r>
+      <w:proofErr w:type="spellEnd"/>
+      <w:r>
+        <w:t xml:space="preserve"> que existe entre los usuarios para que el nuevo usuario tenga el siguiente número.</w:t>
+      </w:r>
+    </w:p>
+    <w:p/>
+    <w:p>
+      <w:pPr>
+        <w:pStyle w:val="Ttulo1"/>
+      </w:pPr>
+      <w:bookmarkStart w:id="17" w:name="_Toc227660530"/>
+      <w:proofErr w:type="spellStart"/>
+      <w:r>
+        <w:t>Promt</w:t>
+      </w:r>
+      <w:proofErr w:type="spellEnd"/>
+      <w:r>
+        <w:t xml:space="preserve"> 18 – </w:t>
+      </w:r>
+      <w:r>
+        <w:t xml:space="preserve">No poner </w:t>
+      </w:r>
+      <w:proofErr w:type="spellStart"/>
+      <w:r>
+        <w:t>num_partner</w:t>
+      </w:r>
+      <w:proofErr w:type="spellEnd"/>
+      <w:r>
+        <w:t xml:space="preserve"> obligatorio</w:t>
+      </w:r>
+      <w:bookmarkEnd w:id="17"/>
+    </w:p>
+    <w:p>
+      <w:pPr>
+        <w:pStyle w:val="NormalWeb"/>
+      </w:pPr>
+      <w:r>
+        <w:t xml:space="preserve">El </w:t>
+      </w:r>
+      <w:proofErr w:type="spellStart"/>
+      <w:r>
+        <w:t>num_partner</w:t>
+      </w:r>
+      <w:proofErr w:type="spellEnd"/>
+      <w:r>
+        <w:t xml:space="preserve"> es un campo opcional en la base de datos, por lo que </w:t>
+      </w:r>
+      <w:proofErr w:type="spellStart"/>
+      <w:r>
+        <w:t>haz</w:t>
+      </w:r>
+      <w:proofErr w:type="spellEnd"/>
+      <w:r>
+        <w:t xml:space="preserve"> que en el </w:t>
+      </w:r>
+      <w:proofErr w:type="spellStart"/>
+      <w:r>
+        <w:t>loginpage</w:t>
+      </w:r>
+      <w:proofErr w:type="spellEnd"/>
+      <w:r>
+        <w:t xml:space="preserve"> no sea obligatorio, que ya lo rellenará un administrador </w:t>
+      </w:r>
+      <w:proofErr w:type="spellStart"/>
+      <w:r>
+        <w:t>mas</w:t>
+      </w:r>
+      <w:proofErr w:type="spellEnd"/>
+      <w:r>
+        <w:t xml:space="preserve"> adelante.</w:t>
+      </w:r>
+    </w:p>
+    <w:p/>
+    <w:p>
+      <w:pPr>
+        <w:pStyle w:val="Ttulo1"/>
+      </w:pPr>
+      <w:bookmarkStart w:id="18" w:name="_Toc227660531"/>
+      <w:proofErr w:type="spellStart"/>
+      <w:r>
+        <w:t>Promt</w:t>
+      </w:r>
+      <w:proofErr w:type="spellEnd"/>
+      <w:r>
+        <w:t xml:space="preserve"> 19 </w:t>
+      </w:r>
+      <w:r>
+        <w:t>–</w:t>
+      </w:r>
+      <w:r>
+        <w:t xml:space="preserve"> </w:t>
+      </w:r>
+      <w:r>
+        <w:t xml:space="preserve">Mensajes </w:t>
+      </w:r>
+      <w:r>
+        <w:t>limitados a 5 segundos</w:t>
+      </w:r>
+      <w:bookmarkEnd w:id="18"/>
+    </w:p>
+    <w:p>
+      <w:pPr>
+        <w:pStyle w:val="NormalWeb"/>
+      </w:pPr>
+      <w:r>
+        <w:t xml:space="preserve">En la </w:t>
+      </w:r>
+      <w:proofErr w:type="spellStart"/>
+      <w:r>
+        <w:t>detailSession</w:t>
+      </w:r>
+      <w:proofErr w:type="spellEnd"/>
+      <w:r>
+        <w:t xml:space="preserve">, cuando se muestra un mensaje de, por ejemplo, “Te has dado de baja de la sesión”, este mensaje se queda de forma permanente en pantalla. Debería permanecer en pantalla solo unos 5 segundos y después desaparecer. Además, también </w:t>
+      </w:r>
+      <w:proofErr w:type="gramStart"/>
+      <w:r>
+        <w:t>debería</w:t>
+      </w:r>
+      <w:proofErr w:type="gramEnd"/>
+      <w:r>
+        <w:t xml:space="preserve"> aparecer temporalmente estos mensajes cuando te das de alta o de baja en una partida. Por último, si te intentas dar de baja en una sesión, y no te deja porque estas apuntado a una partida, debería mostrar también un mensaje indicándolo.</w:t>
+      </w:r>
+    </w:p>
+    <w:p/>
+    <w:p>
+      <w:pPr>
+        <w:pStyle w:val="Ttulo1"/>
+      </w:pPr>
+      <w:bookmarkStart w:id="19" w:name="_Toc227660532"/>
+      <w:proofErr w:type="spellStart"/>
+      <w:r>
+        <w:lastRenderedPageBreak/>
+        <w:t>Promt</w:t>
+      </w:r>
+      <w:proofErr w:type="spellEnd"/>
+      <w:r>
+        <w:t xml:space="preserve"> 20 </w:t>
+      </w:r>
+      <w:r>
+        <w:t>–</w:t>
+      </w:r>
+      <w:r>
+        <w:t xml:space="preserve"> </w:t>
+      </w:r>
+      <w:r>
+        <w:t>Indicar propietario en juegos de mesa</w:t>
+      </w:r>
+      <w:bookmarkEnd w:id="19"/>
+    </w:p>
+    <w:p>
+      <w:pPr>
+        <w:pStyle w:val="NormalWeb"/>
+      </w:pPr>
+      <w:r>
+        <w:t>En la creación y edición de juegos, no permites indicar el propietario (</w:t>
+      </w:r>
+      <w:proofErr w:type="spellStart"/>
+      <w:r>
+        <w:t>owner_user_id</w:t>
+      </w:r>
+      <w:proofErr w:type="spellEnd"/>
+      <w:r>
+        <w:t xml:space="preserve">). Debe haber un </w:t>
+      </w:r>
+      <w:proofErr w:type="spellStart"/>
+      <w:r>
+        <w:t>select</w:t>
+      </w:r>
+      <w:proofErr w:type="spellEnd"/>
+      <w:r>
+        <w:t xml:space="preserve"> con 2 opciones, “</w:t>
+      </w:r>
+      <w:proofErr w:type="spellStart"/>
+      <w:r>
+        <w:t>ZAS”</w:t>
+      </w:r>
+      <w:r>
+        <w:t>a</w:t>
+      </w:r>
+      <w:proofErr w:type="spellEnd"/>
+      <w:r>
+        <w:t xml:space="preserve"> </w:t>
+      </w:r>
+      <w:proofErr w:type="spellStart"/>
+      <w:r>
+        <w:t>null</w:t>
+      </w:r>
+      <w:proofErr w:type="spellEnd"/>
+      <w:r>
+        <w:t xml:space="preserve"> y “Usuario actual” a </w:t>
+      </w:r>
+      <w:r>
+        <w:t>id del usuario actual, que será el valor por defecto.</w:t>
+      </w:r>
+    </w:p>
+    <w:p/>
+    <w:p>
+      <w:pPr>
+        <w:pStyle w:val="Ttulo1"/>
+      </w:pPr>
+      <w:bookmarkStart w:id="20" w:name="_Toc227660533"/>
+      <w:proofErr w:type="spellStart"/>
+      <w:r>
+        <w:t>Promt</w:t>
+      </w:r>
+      <w:proofErr w:type="spellEnd"/>
+      <w:r>
+        <w:t xml:space="preserve"> 21 </w:t>
+      </w:r>
+      <w:r>
+        <w:t>–</w:t>
+      </w:r>
+      <w:r>
+        <w:t xml:space="preserve"> </w:t>
+      </w:r>
+      <w:r>
+        <w:t>Cambiar como muestra el propietario</w:t>
+      </w:r>
+      <w:bookmarkEnd w:id="20"/>
+    </w:p>
+    <w:p>
+      <w:pPr>
+        <w:pStyle w:val="NormalWeb"/>
+      </w:pPr>
+      <w:r>
+        <w:t xml:space="preserve">Tanto en la ludoteca como en el detalle del juego, cuando el juego no es de ZAS, indicas “Usuario #x” donde x es el id del propietario. En lugar de eso debería poner el </w:t>
+      </w:r>
+      <w:proofErr w:type="spellStart"/>
+      <w:r>
+        <w:t>nickname</w:t>
+      </w:r>
+      <w:proofErr w:type="spellEnd"/>
+      <w:r>
+        <w:t xml:space="preserve"> del propietario. Además, en el </w:t>
+      </w:r>
+      <w:proofErr w:type="spellStart"/>
+      <w:r>
+        <w:t>select</w:t>
+      </w:r>
+      <w:proofErr w:type="spellEnd"/>
+      <w:r>
+        <w:t xml:space="preserve"> para indicar el propietario del juego. Muestras “ZAS! (del club). Cámbialo por “ZAS”.</w:t>
+      </w:r>
+    </w:p>
+    <w:p/>
+    <w:p>
+      <w:pPr>
+        <w:pStyle w:val="Ttulo1"/>
+      </w:pPr>
+      <w:bookmarkStart w:id="21" w:name="_Toc227660534"/>
+      <w:proofErr w:type="spellStart"/>
+      <w:r>
+        <w:t>Promt</w:t>
+      </w:r>
+      <w:proofErr w:type="spellEnd"/>
+      <w:r>
+        <w:t xml:space="preserve"> 22 </w:t>
+      </w:r>
+      <w:r>
+        <w:t>–</w:t>
+      </w:r>
+      <w:r>
+        <w:t xml:space="preserve"> </w:t>
+      </w:r>
+      <w:r>
+        <w:t>Añadir creador de partida en listado de sesión</w:t>
+      </w:r>
+      <w:bookmarkEnd w:id="21"/>
+    </w:p>
+    <w:p>
+      <w:pPr>
+        <w:pStyle w:val="NormalWeb"/>
+      </w:pPr>
+      <w:r>
+        <w:t xml:space="preserve">En el detalle de una sesión, donde se muestran las partidas creadas, debería aparecer el </w:t>
+      </w:r>
+      <w:proofErr w:type="spellStart"/>
+      <w:r>
+        <w:t>nickname</w:t>
+      </w:r>
+      <w:proofErr w:type="spellEnd"/>
+      <w:r>
+        <w:t xml:space="preserve"> del usuario creador de la partida (</w:t>
+      </w:r>
+      <w:proofErr w:type="spellStart"/>
+      <w:r>
+        <w:t>host_user_id</w:t>
+      </w:r>
+      <w:proofErr w:type="spellEnd"/>
+      <w:r>
+        <w:t>)</w:t>
+      </w:r>
+    </w:p>
+    <w:p/>
+    <w:p>
+      <w:pPr>
+        <w:pStyle w:val="Ttulo1"/>
+      </w:pPr>
+      <w:bookmarkStart w:id="22" w:name="_Toc227660535"/>
+      <w:proofErr w:type="spellStart"/>
+      <w:r>
+        <w:t>Promt</w:t>
+      </w:r>
+      <w:proofErr w:type="spellEnd"/>
+      <w:r>
+        <w:t xml:space="preserve"> 23 </w:t>
+      </w:r>
+      <w:r>
+        <w:t>–</w:t>
+      </w:r>
+      <w:r>
+        <w:t xml:space="preserve"> </w:t>
+      </w:r>
+      <w:r>
+        <w:t>Cambiar color botón editar</w:t>
+      </w:r>
+      <w:bookmarkEnd w:id="22"/>
+    </w:p>
+    <w:p>
+      <w:pPr>
+        <w:pStyle w:val="NormalWeb"/>
+      </w:pPr>
+      <w:r>
+        <w:t xml:space="preserve">No me gusta el color de fondo que tiene el botón de crear partida. Mejor ponle el color </w:t>
+      </w:r>
+      <w:proofErr w:type="spellStart"/>
+      <w:r>
+        <w:t>primary</w:t>
+      </w:r>
+      <w:proofErr w:type="spellEnd"/>
+      <w:r>
+        <w:t>. Y el botón de editar partida es muy poco intuitivo. Añádele “Editar” al lado del icono lápiz.</w:t>
+      </w:r>
+    </w:p>
+    <w:p/>
+    <w:p>
+      <w:pPr>
+        <w:pStyle w:val="Ttulo1"/>
+      </w:pPr>
+      <w:bookmarkStart w:id="23" w:name="_Toc227660536"/>
+      <w:proofErr w:type="spellStart"/>
+      <w:r>
+        <w:t>Promt</w:t>
+      </w:r>
+      <w:proofErr w:type="spellEnd"/>
+      <w:r>
+        <w:t xml:space="preserve"> 24 – </w:t>
+      </w:r>
+      <w:r>
+        <w:t>Ver jugadores en edición de partida y dar opción a borrarlos</w:t>
+      </w:r>
+      <w:bookmarkEnd w:id="23"/>
+    </w:p>
+    <w:p>
+      <w:pPr>
+        <w:pStyle w:val="NormalWeb"/>
+      </w:pPr>
+      <w:r>
+        <w:t>En la pantalla de edición de partidas, se han de ver los jugadores apuntados. Además, si la partida no está iniciada ni acabada, el propietario de la partida o un administrador, podrán dar de baja jugadores.</w:t>
+      </w:r>
+    </w:p>
+    <w:p/>
+    <w:p>
+      <w:pPr>
+        <w:pStyle w:val="Ttulo1"/>
+      </w:pPr>
+      <w:bookmarkStart w:id="24" w:name="_Toc227660537"/>
+      <w:proofErr w:type="spellStart"/>
+      <w:r>
+        <w:lastRenderedPageBreak/>
+        <w:t>Promt</w:t>
+      </w:r>
+      <w:proofErr w:type="spellEnd"/>
+      <w:r>
+        <w:t xml:space="preserve"> 25 </w:t>
+      </w:r>
+      <w:r>
+        <w:t>–</w:t>
+      </w:r>
+      <w:r>
+        <w:t xml:space="preserve"> </w:t>
+      </w:r>
+      <w:r>
+        <w:t>Habilitar la eliminación del anfitrión</w:t>
+      </w:r>
+      <w:bookmarkEnd w:id="24"/>
+    </w:p>
+    <w:p>
+      <w:pPr>
+        <w:pStyle w:val="NormalWeb"/>
+      </w:pPr>
+      <w:r>
+        <w:t>En la edición de las partidas, también se ha de poder eliminar al anfitrión.</w:t>
+      </w:r>
+    </w:p>
+    <w:p/>
+    <w:p>
+      <w:pPr>
+        <w:pStyle w:val="Ttulo1"/>
+      </w:pPr>
+      <w:bookmarkStart w:id="25" w:name="_Toc227660538"/>
+      <w:proofErr w:type="spellStart"/>
+      <w:r>
+        <w:t>Promt</w:t>
+      </w:r>
+      <w:proofErr w:type="spellEnd"/>
+      <w:r>
+        <w:t xml:space="preserve"> 26 – Arreglar </w:t>
+      </w:r>
+      <w:r>
+        <w:t>los tipos de los juegos de mesa</w:t>
+      </w:r>
+      <w:bookmarkEnd w:id="25"/>
+    </w:p>
+    <w:p/>
+    <w:p>
+      <w:r>
+        <w:t xml:space="preserve">Bien, he visto que </w:t>
+      </w:r>
+      <w:r>
+        <w:t xml:space="preserve">los juegos de mesa no están teniendo en cuenta la tabla </w:t>
+      </w:r>
+      <w:proofErr w:type="spellStart"/>
+      <w:r>
+        <w:t>boardgame_type</w:t>
+      </w:r>
+      <w:proofErr w:type="spellEnd"/>
+      <w:r>
+        <w:t>, donde se indican a que tipos pertenece cada juego. Tiene que tenerlo en cuenta tanto al cargar/editar la ficha para mostrar los tipos a los que pertenece, como al guardarlo cuando se crea o edita un juego. Te paso la estructura de la tabla que no te pasé inicialmente:</w:t>
+      </w:r>
+      <w:r>
+        <w:br/>
+      </w:r>
+      <w:proofErr w:type="spellStart"/>
+      <w:r>
+        <w:t>Schema</w:t>
+      </w:r>
+      <w:proofErr w:type="spellEnd"/>
+      <w:proofErr w:type="gramStart"/>
+      <w:r>
+        <w:t>::</w:t>
+      </w:r>
+      <w:proofErr w:type="spellStart"/>
+      <w:r>
+        <w:t>create</w:t>
+      </w:r>
+      <w:proofErr w:type="spellEnd"/>
+      <w:proofErr w:type="gramEnd"/>
+      <w:r>
+        <w:t>('</w:t>
+      </w:r>
+      <w:proofErr w:type="spellStart"/>
+      <w:r>
+        <w:t>boardgame_type</w:t>
+      </w:r>
+      <w:proofErr w:type="spellEnd"/>
+      <w:r>
+        <w:t xml:space="preserve">', </w:t>
+      </w:r>
+      <w:proofErr w:type="spellStart"/>
+      <w:r>
+        <w:t>function</w:t>
+      </w:r>
+      <w:proofErr w:type="spellEnd"/>
+      <w:r>
+        <w:t xml:space="preserve"> (</w:t>
+      </w:r>
+      <w:proofErr w:type="spellStart"/>
+      <w:r>
+        <w:t>Blueprint</w:t>
+      </w:r>
+      <w:proofErr w:type="spellEnd"/>
+      <w:r>
+        <w:t xml:space="preserve"> $</w:t>
+      </w:r>
+      <w:proofErr w:type="spellStart"/>
+      <w:r>
+        <w:t>table</w:t>
+      </w:r>
+      <w:proofErr w:type="spellEnd"/>
+      <w:r>
+        <w:t>) {</w:t>
+      </w:r>
+    </w:p>
+    <w:p>
+      <w:pPr>
+        <w:spacing w:line="240" w:lineRule="auto"/>
+      </w:pPr>
+      <w:r>
+        <w:t>$</w:t>
+      </w:r>
+      <w:proofErr w:type="spellStart"/>
+      <w:r>
+        <w:t>table</w:t>
+      </w:r>
+      <w:proofErr w:type="spellEnd"/>
+      <w:r>
+        <w:t>-&gt;</w:t>
+      </w:r>
+      <w:proofErr w:type="gramStart"/>
+      <w:r>
+        <w:t>id(</w:t>
+      </w:r>
+      <w:proofErr w:type="gramEnd"/>
+      <w:r>
+        <w:t>);</w:t>
+      </w:r>
+    </w:p>
+    <w:p>
+      <w:pPr>
+        <w:spacing w:line="240" w:lineRule="auto"/>
+      </w:pPr>
+      <w:r>
+        <w:t>$table-&gt;</w:t>
+      </w:r>
+      <w:proofErr w:type="gramStart"/>
+      <w:r>
+        <w:t>foreignId(</w:t>
+      </w:r>
+      <w:proofErr w:type="gramEnd"/>
+      <w:r>
+        <w:t>'boardgame_id')-&gt;constrained('boardgames')-&gt;onDelete('cascade');</w:t>
+      </w:r>
+    </w:p>
+    <w:p>
+      <w:pPr>
+        <w:spacing w:line="240" w:lineRule="auto"/>
+      </w:pPr>
+      <w:r>
+        <w:t>$table-&gt;</w:t>
+      </w:r>
+      <w:proofErr w:type="gramStart"/>
+      <w:r>
+        <w:t>foreignId(</w:t>
+      </w:r>
+      <w:proofErr w:type="gramEnd"/>
+      <w:r>
+        <w:t xml:space="preserve">'type_id')-&gt;constrained('types')-&gt;onDelete('cascade'); </w:t>
+      </w:r>
+    </w:p>
+    <w:p>
+      <w:pPr>
+        <w:spacing w:line="240" w:lineRule="auto"/>
+      </w:pPr>
+      <w:r>
+        <w:t>$</w:t>
+      </w:r>
+      <w:proofErr w:type="spellStart"/>
+      <w:r>
+        <w:t>table</w:t>
+      </w:r>
+      <w:proofErr w:type="spellEnd"/>
+      <w:r>
+        <w:t>-&gt;</w:t>
+      </w:r>
+      <w:proofErr w:type="spellStart"/>
+      <w:proofErr w:type="gramStart"/>
+      <w:r>
+        <w:t>timestamps</w:t>
+      </w:r>
+      <w:proofErr w:type="spellEnd"/>
+      <w:r>
+        <w:t>(</w:t>
+      </w:r>
+      <w:proofErr w:type="gramEnd"/>
+      <w:r>
+        <w:t>);</w:t>
+      </w:r>
+    </w:p>
+    <w:p>
+      <w:pPr>
+        <w:spacing w:line="240" w:lineRule="auto"/>
+      </w:pPr>
+      <w:r>
+        <w:t>$</w:t>
+      </w:r>
+      <w:proofErr w:type="spellStart"/>
+      <w:r>
+        <w:t>table</w:t>
+      </w:r>
+      <w:proofErr w:type="spellEnd"/>
+      <w:r>
+        <w:t>-&gt;</w:t>
+      </w:r>
+      <w:proofErr w:type="spellStart"/>
+      <w:proofErr w:type="gramStart"/>
+      <w:r>
+        <w:t>unique</w:t>
+      </w:r>
+      <w:proofErr w:type="spellEnd"/>
+      <w:r>
+        <w:t>(</w:t>
+      </w:r>
+      <w:proofErr w:type="gramEnd"/>
+      <w:r>
+        <w:t>['</w:t>
+      </w:r>
+      <w:proofErr w:type="spellStart"/>
+      <w:r>
+        <w:t>boardgame_id','type_id</w:t>
+      </w:r>
+      <w:proofErr w:type="spellEnd"/>
+      <w:r>
+        <w:t xml:space="preserve">']);           </w:t>
+      </w:r>
+    </w:p>
+    <w:p>
+      <w:pPr>
+        <w:spacing w:line="240" w:lineRule="auto"/>
+      </w:pPr>
+      <w:r>
+        <w:t>});</w:t>
+      </w:r>
+    </w:p>
     <w:sectPr>
       <w:pgSz w:w="11906" w:h="16838"/>
       <w:pgMar w:top="1417" w:right="1701" w:bottom="1417" w:left="1701" w:header="708" w:footer="708" w:gutter="0"/>
@@ -11868,6 +15141,22 @@
       <w:rFonts w:ascii="Tahoma" w:hAnsi="Tahoma" w:cs="Tahoma"/>
       <w:sz w:val="16"/>
       <w:szCs w:val="16"/>
+    </w:rPr>
+  </w:style>
+  <w:style w:type="paragraph" w:styleId="NormalWeb">
+    <w:name w:val="Normal (Web)"/>
+    <w:basedOn w:val="Normal"/>
+    <w:uiPriority w:val="99"/>
+    <w:semiHidden/>
+    <w:unhideWhenUsed/>
+    <w:rsid w:val="00772241"/>
+    <w:pPr>
+      <w:spacing w:before="100" w:beforeAutospacing="1" w:after="100" w:afterAutospacing="1" w:line="240" w:lineRule="auto"/>
+    </w:pPr>
+    <w:rPr>
+      <w:rFonts w:ascii="Times New Roman" w:eastAsia="Times New Roman" w:hAnsi="Times New Roman" w:cs="Times New Roman"/>
+      <w:sz w:val="24"/>
+      <w:szCs w:val="24"/>
     </w:rPr>
   </w:style>
 </w:styles>

</xml_diff>

<commit_message>
Updated readme and word
</commit_message>
<xml_diff>
--- a/Promt con Claude.docx
+++ b/Promt con Claude.docx
@@ -135,7 +135,7 @@
           <w:r>
             <w:fldChar w:fldCharType="separate"/>
           </w:r>
-          <w:hyperlink w:anchor="_Toc227660513" w:history="1">
+          <w:hyperlink w:anchor="_Toc227661606" w:history="1">
             <w:r>
               <w:rPr>
                 <w:rStyle w:val="Hipervnculo"/>
@@ -162,7 +162,7 @@
                 <w:noProof/>
                 <w:webHidden/>
               </w:rPr>
-              <w:instrText xml:space="preserve"> PAGEREF _Toc227660513 \h </w:instrText>
+              <w:instrText xml:space="preserve"> PAGEREF _Toc227661606 \h </w:instrText>
             </w:r>
             <w:r>
               <w:rPr>
@@ -203,7 +203,7 @@
               <w:noProof/>
             </w:rPr>
           </w:pPr>
-          <w:hyperlink w:anchor="_Toc227660514" w:history="1">
+          <w:hyperlink w:anchor="_Toc227661607" w:history="1">
             <w:r>
               <w:rPr>
                 <w:rStyle w:val="Hipervnculo"/>
@@ -230,7 +230,7 @@
                 <w:noProof/>
                 <w:webHidden/>
               </w:rPr>
-              <w:instrText xml:space="preserve"> PAGEREF _Toc227660514 \h </w:instrText>
+              <w:instrText xml:space="preserve"> PAGEREF _Toc227661607 \h </w:instrText>
             </w:r>
             <w:r>
               <w:rPr>
@@ -271,7 +271,7 @@
               <w:noProof/>
             </w:rPr>
           </w:pPr>
-          <w:hyperlink w:anchor="_Toc227660515" w:history="1">
+          <w:hyperlink w:anchor="_Toc227661608" w:history="1">
             <w:r>
               <w:rPr>
                 <w:rStyle w:val="Hipervnculo"/>
@@ -298,7 +298,7 @@
                 <w:noProof/>
                 <w:webHidden/>
               </w:rPr>
-              <w:instrText xml:space="preserve"> PAGEREF _Toc227660515 \h </w:instrText>
+              <w:instrText xml:space="preserve"> PAGEREF _Toc227661608 \h </w:instrText>
             </w:r>
             <w:r>
               <w:rPr>
@@ -339,7 +339,7 @@
               <w:noProof/>
             </w:rPr>
           </w:pPr>
-          <w:hyperlink w:anchor="_Toc227660516" w:history="1">
+          <w:hyperlink w:anchor="_Toc227661609" w:history="1">
             <w:r>
               <w:rPr>
                 <w:rStyle w:val="Hipervnculo"/>
@@ -366,7 +366,7 @@
                 <w:noProof/>
                 <w:webHidden/>
               </w:rPr>
-              <w:instrText xml:space="preserve"> PAGEREF _Toc227660516 \h </w:instrText>
+              <w:instrText xml:space="preserve"> PAGEREF _Toc227661609 \h </w:instrText>
             </w:r>
             <w:r>
               <w:rPr>
@@ -407,7 +407,7 @@
               <w:noProof/>
             </w:rPr>
           </w:pPr>
-          <w:hyperlink w:anchor="_Toc227660517" w:history="1">
+          <w:hyperlink w:anchor="_Toc227661610" w:history="1">
             <w:r>
               <w:rPr>
                 <w:rStyle w:val="Hipervnculo"/>
@@ -434,7 +434,7 @@
                 <w:noProof/>
                 <w:webHidden/>
               </w:rPr>
-              <w:instrText xml:space="preserve"> PAGEREF _Toc227660517 \h </w:instrText>
+              <w:instrText xml:space="preserve"> PAGEREF _Toc227661610 \h </w:instrText>
             </w:r>
             <w:r>
               <w:rPr>
@@ -475,7 +475,7 @@
               <w:noProof/>
             </w:rPr>
           </w:pPr>
-          <w:hyperlink w:anchor="_Toc227660518" w:history="1">
+          <w:hyperlink w:anchor="_Toc227661611" w:history="1">
             <w:r>
               <w:rPr>
                 <w:rStyle w:val="Hipervnculo"/>
@@ -502,7 +502,7 @@
                 <w:noProof/>
                 <w:webHidden/>
               </w:rPr>
-              <w:instrText xml:space="preserve"> PAGEREF _Toc227660518 \h </w:instrText>
+              <w:instrText xml:space="preserve"> PAGEREF _Toc227661611 \h </w:instrText>
             </w:r>
             <w:r>
               <w:rPr>
@@ -543,7 +543,7 @@
               <w:noProof/>
             </w:rPr>
           </w:pPr>
-          <w:hyperlink w:anchor="_Toc227660519" w:history="1">
+          <w:hyperlink w:anchor="_Toc227661612" w:history="1">
             <w:r>
               <w:rPr>
                 <w:rStyle w:val="Hipervnculo"/>
@@ -570,7 +570,7 @@
                 <w:noProof/>
                 <w:webHidden/>
               </w:rPr>
-              <w:instrText xml:space="preserve"> PAGEREF _Toc227660519 \h </w:instrText>
+              <w:instrText xml:space="preserve"> PAGEREF _Toc227661612 \h </w:instrText>
             </w:r>
             <w:r>
               <w:rPr>
@@ -611,7 +611,7 @@
               <w:noProof/>
             </w:rPr>
           </w:pPr>
-          <w:hyperlink w:anchor="_Toc227660520" w:history="1">
+          <w:hyperlink w:anchor="_Toc227661613" w:history="1">
             <w:r>
               <w:rPr>
                 <w:rStyle w:val="Hipervnculo"/>
@@ -638,7 +638,7 @@
                 <w:noProof/>
                 <w:webHidden/>
               </w:rPr>
-              <w:instrText xml:space="preserve"> PAGEREF _Toc227660520 \h </w:instrText>
+              <w:instrText xml:space="preserve"> PAGEREF _Toc227661613 \h </w:instrText>
             </w:r>
             <w:r>
               <w:rPr>
@@ -679,7 +679,7 @@
               <w:noProof/>
             </w:rPr>
           </w:pPr>
-          <w:hyperlink w:anchor="_Toc227660521" w:history="1">
+          <w:hyperlink w:anchor="_Toc227661614" w:history="1">
             <w:r>
               <w:rPr>
                 <w:rStyle w:val="Hipervnculo"/>
@@ -706,7 +706,7 @@
                 <w:noProof/>
                 <w:webHidden/>
               </w:rPr>
-              <w:instrText xml:space="preserve"> PAGEREF _Toc227660521 \h </w:instrText>
+              <w:instrText xml:space="preserve"> PAGEREF _Toc227661614 \h </w:instrText>
             </w:r>
             <w:r>
               <w:rPr>
@@ -747,7 +747,7 @@
               <w:noProof/>
             </w:rPr>
           </w:pPr>
-          <w:hyperlink w:anchor="_Toc227660522" w:history="1">
+          <w:hyperlink w:anchor="_Toc227661615" w:history="1">
             <w:r>
               <w:rPr>
                 <w:rStyle w:val="Hipervnculo"/>
@@ -774,7 +774,7 @@
                 <w:noProof/>
                 <w:webHidden/>
               </w:rPr>
-              <w:instrText xml:space="preserve"> PAGEREF _Toc227660522 \h </w:instrText>
+              <w:instrText xml:space="preserve"> PAGEREF _Toc227661615 \h </w:instrText>
             </w:r>
             <w:r>
               <w:rPr>
@@ -815,7 +815,7 @@
               <w:noProof/>
             </w:rPr>
           </w:pPr>
-          <w:hyperlink w:anchor="_Toc227660523" w:history="1">
+          <w:hyperlink w:anchor="_Toc227661616" w:history="1">
             <w:r>
               <w:rPr>
                 <w:rStyle w:val="Hipervnculo"/>
@@ -842,7 +842,7 @@
                 <w:noProof/>
                 <w:webHidden/>
               </w:rPr>
-              <w:instrText xml:space="preserve"> PAGEREF _Toc227660523 \h </w:instrText>
+              <w:instrText xml:space="preserve"> PAGEREF _Toc227661616 \h </w:instrText>
             </w:r>
             <w:r>
               <w:rPr>
@@ -883,7 +883,7 @@
               <w:noProof/>
             </w:rPr>
           </w:pPr>
-          <w:hyperlink w:anchor="_Toc227660524" w:history="1">
+          <w:hyperlink w:anchor="_Toc227661617" w:history="1">
             <w:r>
               <w:rPr>
                 <w:rStyle w:val="Hipervnculo"/>
@@ -910,7 +910,7 @@
                 <w:noProof/>
                 <w:webHidden/>
               </w:rPr>
-              <w:instrText xml:space="preserve"> PAGEREF _Toc227660524 \h </w:instrText>
+              <w:instrText xml:space="preserve"> PAGEREF _Toc227661617 \h </w:instrText>
             </w:r>
             <w:r>
               <w:rPr>
@@ -951,7 +951,7 @@
               <w:noProof/>
             </w:rPr>
           </w:pPr>
-          <w:hyperlink w:anchor="_Toc227660525" w:history="1">
+          <w:hyperlink w:anchor="_Toc227661618" w:history="1">
             <w:r>
               <w:rPr>
                 <w:rStyle w:val="Hipervnculo"/>
@@ -978,7 +978,7 @@
                 <w:noProof/>
                 <w:webHidden/>
               </w:rPr>
-              <w:instrText xml:space="preserve"> PAGEREF _Toc227660525 \h </w:instrText>
+              <w:instrText xml:space="preserve"> PAGEREF _Toc227661618 \h </w:instrText>
             </w:r>
             <w:r>
               <w:rPr>
@@ -1019,7 +1019,7 @@
               <w:noProof/>
             </w:rPr>
           </w:pPr>
-          <w:hyperlink w:anchor="_Toc227660526" w:history="1">
+          <w:hyperlink w:anchor="_Toc227661619" w:history="1">
             <w:r>
               <w:rPr>
                 <w:rStyle w:val="Hipervnculo"/>
@@ -1046,7 +1046,7 @@
                 <w:noProof/>
                 <w:webHidden/>
               </w:rPr>
-              <w:instrText xml:space="preserve"> PAGEREF _Toc227660526 \h </w:instrText>
+              <w:instrText xml:space="preserve"> PAGEREF _Toc227661619 \h </w:instrText>
             </w:r>
             <w:r>
               <w:rPr>
@@ -1087,7 +1087,7 @@
               <w:noProof/>
             </w:rPr>
           </w:pPr>
-          <w:hyperlink w:anchor="_Toc227660527" w:history="1">
+          <w:hyperlink w:anchor="_Toc227661620" w:history="1">
             <w:r>
               <w:rPr>
                 <w:rStyle w:val="Hipervnculo"/>
@@ -1114,7 +1114,7 @@
                 <w:noProof/>
                 <w:webHidden/>
               </w:rPr>
-              <w:instrText xml:space="preserve"> PAGEREF _Toc227660527 \h </w:instrText>
+              <w:instrText xml:space="preserve"> PAGEREF _Toc227661620 \h </w:instrText>
             </w:r>
             <w:r>
               <w:rPr>
@@ -1155,7 +1155,7 @@
               <w:noProof/>
             </w:rPr>
           </w:pPr>
-          <w:hyperlink w:anchor="_Toc227660528" w:history="1">
+          <w:hyperlink w:anchor="_Toc227661621" w:history="1">
             <w:r>
               <w:rPr>
                 <w:rStyle w:val="Hipervnculo"/>
@@ -1182,7 +1182,7 @@
                 <w:noProof/>
                 <w:webHidden/>
               </w:rPr>
-              <w:instrText xml:space="preserve"> PAGEREF _Toc227660528 \h </w:instrText>
+              <w:instrText xml:space="preserve"> PAGEREF _Toc227661621 \h </w:instrText>
             </w:r>
             <w:r>
               <w:rPr>
@@ -1223,7 +1223,7 @@
               <w:noProof/>
             </w:rPr>
           </w:pPr>
-          <w:hyperlink w:anchor="_Toc227660529" w:history="1">
+          <w:hyperlink w:anchor="_Toc227661622" w:history="1">
             <w:r>
               <w:rPr>
                 <w:rStyle w:val="Hipervnculo"/>
@@ -1250,7 +1250,7 @@
                 <w:noProof/>
                 <w:webHidden/>
               </w:rPr>
-              <w:instrText xml:space="preserve"> PAGEREF _Toc227660529 \h </w:instrText>
+              <w:instrText xml:space="preserve"> PAGEREF _Toc227661622 \h </w:instrText>
             </w:r>
             <w:r>
               <w:rPr>
@@ -1291,7 +1291,7 @@
               <w:noProof/>
             </w:rPr>
           </w:pPr>
-          <w:hyperlink w:anchor="_Toc227660530" w:history="1">
+          <w:hyperlink w:anchor="_Toc227661623" w:history="1">
             <w:r>
               <w:rPr>
                 <w:rStyle w:val="Hipervnculo"/>
@@ -1318,7 +1318,7 @@
                 <w:noProof/>
                 <w:webHidden/>
               </w:rPr>
-              <w:instrText xml:space="preserve"> PAGEREF _Toc227660530 \h </w:instrText>
+              <w:instrText xml:space="preserve"> PAGEREF _Toc227661623 \h </w:instrText>
             </w:r>
             <w:r>
               <w:rPr>
@@ -1359,7 +1359,7 @@
               <w:noProof/>
             </w:rPr>
           </w:pPr>
-          <w:hyperlink w:anchor="_Toc227660531" w:history="1">
+          <w:hyperlink w:anchor="_Toc227661624" w:history="1">
             <w:r>
               <w:rPr>
                 <w:rStyle w:val="Hipervnculo"/>
@@ -1386,7 +1386,7 @@
                 <w:noProof/>
                 <w:webHidden/>
               </w:rPr>
-              <w:instrText xml:space="preserve"> PAGEREF _Toc227660531 \h </w:instrText>
+              <w:instrText xml:space="preserve"> PAGEREF _Toc227661624 \h </w:instrText>
             </w:r>
             <w:r>
               <w:rPr>
@@ -1427,7 +1427,7 @@
               <w:noProof/>
             </w:rPr>
           </w:pPr>
-          <w:hyperlink w:anchor="_Toc227660532" w:history="1">
+          <w:hyperlink w:anchor="_Toc227661625" w:history="1">
             <w:r>
               <w:rPr>
                 <w:rStyle w:val="Hipervnculo"/>
@@ -1454,7 +1454,7 @@
                 <w:noProof/>
                 <w:webHidden/>
               </w:rPr>
-              <w:instrText xml:space="preserve"> PAGEREF _Toc227660532 \h </w:instrText>
+              <w:instrText xml:space="preserve"> PAGEREF _Toc227661625 \h </w:instrText>
             </w:r>
             <w:r>
               <w:rPr>
@@ -1495,7 +1495,7 @@
               <w:noProof/>
             </w:rPr>
           </w:pPr>
-          <w:hyperlink w:anchor="_Toc227660533" w:history="1">
+          <w:hyperlink w:anchor="_Toc227661626" w:history="1">
             <w:r>
               <w:rPr>
                 <w:rStyle w:val="Hipervnculo"/>
@@ -1522,7 +1522,7 @@
                 <w:noProof/>
                 <w:webHidden/>
               </w:rPr>
-              <w:instrText xml:space="preserve"> PAGEREF _Toc227660533 \h </w:instrText>
+              <w:instrText xml:space="preserve"> PAGEREF _Toc227661626 \h </w:instrText>
             </w:r>
             <w:r>
               <w:rPr>
@@ -1563,7 +1563,7 @@
               <w:noProof/>
             </w:rPr>
           </w:pPr>
-          <w:hyperlink w:anchor="_Toc227660534" w:history="1">
+          <w:hyperlink w:anchor="_Toc227661627" w:history="1">
             <w:r>
               <w:rPr>
                 <w:rStyle w:val="Hipervnculo"/>
@@ -1590,7 +1590,7 @@
                 <w:noProof/>
                 <w:webHidden/>
               </w:rPr>
-              <w:instrText xml:space="preserve"> PAGEREF _Toc227660534 \h </w:instrText>
+              <w:instrText xml:space="preserve"> PAGEREF _Toc227661627 \h </w:instrText>
             </w:r>
             <w:r>
               <w:rPr>
@@ -1631,7 +1631,7 @@
               <w:noProof/>
             </w:rPr>
           </w:pPr>
-          <w:hyperlink w:anchor="_Toc227660535" w:history="1">
+          <w:hyperlink w:anchor="_Toc227661628" w:history="1">
             <w:r>
               <w:rPr>
                 <w:rStyle w:val="Hipervnculo"/>
@@ -1658,7 +1658,7 @@
                 <w:noProof/>
                 <w:webHidden/>
               </w:rPr>
-              <w:instrText xml:space="preserve"> PAGEREF _Toc227660535 \h </w:instrText>
+              <w:instrText xml:space="preserve"> PAGEREF _Toc227661628 \h </w:instrText>
             </w:r>
             <w:r>
               <w:rPr>
@@ -1699,7 +1699,7 @@
               <w:noProof/>
             </w:rPr>
           </w:pPr>
-          <w:hyperlink w:anchor="_Toc227660536" w:history="1">
+          <w:hyperlink w:anchor="_Toc227661629" w:history="1">
             <w:r>
               <w:rPr>
                 <w:rStyle w:val="Hipervnculo"/>
@@ -1726,7 +1726,7 @@
                 <w:noProof/>
                 <w:webHidden/>
               </w:rPr>
-              <w:instrText xml:space="preserve"> PAGEREF _Toc227660536 \h </w:instrText>
+              <w:instrText xml:space="preserve"> PAGEREF _Toc227661629 \h </w:instrText>
             </w:r>
             <w:r>
               <w:rPr>
@@ -1767,7 +1767,7 @@
               <w:noProof/>
             </w:rPr>
           </w:pPr>
-          <w:hyperlink w:anchor="_Toc227660537" w:history="1">
+          <w:hyperlink w:anchor="_Toc227661630" w:history="1">
             <w:r>
               <w:rPr>
                 <w:rStyle w:val="Hipervnculo"/>
@@ -1794,7 +1794,7 @@
                 <w:noProof/>
                 <w:webHidden/>
               </w:rPr>
-              <w:instrText xml:space="preserve"> PAGEREF _Toc227660537 \h </w:instrText>
+              <w:instrText xml:space="preserve"> PAGEREF _Toc227661630 \h </w:instrText>
             </w:r>
             <w:r>
               <w:rPr>
@@ -1835,7 +1835,7 @@
               <w:noProof/>
             </w:rPr>
           </w:pPr>
-          <w:hyperlink w:anchor="_Toc227660538" w:history="1">
+          <w:hyperlink w:anchor="_Toc227661631" w:history="1">
             <w:r>
               <w:rPr>
                 <w:rStyle w:val="Hipervnculo"/>
@@ -1862,7 +1862,75 @@
                 <w:noProof/>
                 <w:webHidden/>
               </w:rPr>
-              <w:instrText xml:space="preserve"> PAGEREF _Toc227660538 \h </w:instrText>
+              <w:instrText xml:space="preserve"> PAGEREF _Toc227661631 \h </w:instrText>
+            </w:r>
+            <w:r>
+              <w:rPr>
+                <w:noProof/>
+                <w:webHidden/>
+              </w:rPr>
+            </w:r>
+            <w:r>
+              <w:rPr>
+                <w:noProof/>
+                <w:webHidden/>
+              </w:rPr>
+              <w:fldChar w:fldCharType="separate"/>
+            </w:r>
+            <w:r>
+              <w:rPr>
+                <w:noProof/>
+                <w:webHidden/>
+              </w:rPr>
+              <w:t>17</w:t>
+            </w:r>
+            <w:r>
+              <w:rPr>
+                <w:noProof/>
+                <w:webHidden/>
+              </w:rPr>
+              <w:fldChar w:fldCharType="end"/>
+            </w:r>
+          </w:hyperlink>
+        </w:p>
+        <w:p>
+          <w:pPr>
+            <w:pStyle w:val="TDC1"/>
+            <w:tabs>
+              <w:tab w:val="right" w:leader="dot" w:pos="8494"/>
+            </w:tabs>
+            <w:rPr>
+              <w:noProof/>
+            </w:rPr>
+          </w:pPr>
+          <w:hyperlink w:anchor="_Toc227661632" w:history="1">
+            <w:r>
+              <w:rPr>
+                <w:rStyle w:val="Hipervnculo"/>
+                <w:noProof/>
+              </w:rPr>
+              <w:t>Promt 27 – Readme</w:t>
+            </w:r>
+            <w:r>
+              <w:rPr>
+                <w:noProof/>
+                <w:webHidden/>
+              </w:rPr>
+              <w:tab/>
+            </w:r>
+            <w:r>
+              <w:rPr>
+                <w:noProof/>
+                <w:webHidden/>
+              </w:rPr>
+              <w:fldChar w:fldCharType="begin"/>
+            </w:r>
+            <w:r>
+              <w:rPr>
+                <w:noProof/>
+                <w:webHidden/>
+              </w:rPr>
+              <w:instrText xml:space="preserve"> PAGEREF _Toc227661632 \h </w:instrText>
             </w:r>
             <w:r>
               <w:rPr>
@@ -1925,7 +1993,7 @@
       <w:pPr>
         <w:pStyle w:val="Ttulo1"/>
       </w:pPr>
-      <w:bookmarkStart w:id="0" w:name="_Toc227660513"/>
+      <w:bookmarkStart w:id="0" w:name="_Toc227661606"/>
       <w:proofErr w:type="spellStart"/>
       <w:r>
         <w:lastRenderedPageBreak/>
@@ -9475,7 +9543,7 @@
       <w:pPr>
         <w:pStyle w:val="Ttulo1"/>
       </w:pPr>
-      <w:bookmarkStart w:id="1" w:name="_Toc227660514"/>
+      <w:bookmarkStart w:id="1" w:name="_Toc227661607"/>
       <w:proofErr w:type="spellStart"/>
       <w:r>
         <w:t>Promt</w:t>
@@ -12629,7 +12697,7 @@
       <w:pPr>
         <w:pStyle w:val="Ttulo1"/>
       </w:pPr>
-      <w:bookmarkStart w:id="2" w:name="_Toc227660515"/>
+      <w:bookmarkStart w:id="2" w:name="_Toc227661608"/>
       <w:proofErr w:type="spellStart"/>
       <w:r>
         <w:t>Promt</w:t>
@@ -12836,7 +12904,7 @@
       <w:pPr>
         <w:pStyle w:val="Ttulo1"/>
       </w:pPr>
-      <w:bookmarkStart w:id="3" w:name="_Toc227660516"/>
+      <w:bookmarkStart w:id="3" w:name="_Toc227661609"/>
       <w:proofErr w:type="spellStart"/>
       <w:r>
         <w:t>Promt</w:t>
@@ -12955,7 +13023,7 @@
       <w:pPr>
         <w:pStyle w:val="Ttulo1"/>
       </w:pPr>
-      <w:bookmarkStart w:id="4" w:name="_Toc227660517"/>
+      <w:bookmarkStart w:id="4" w:name="_Toc227661610"/>
       <w:proofErr w:type="spellStart"/>
       <w:r>
         <w:t>Promt</w:t>
@@ -13053,7 +13121,7 @@
       <w:pPr>
         <w:pStyle w:val="Ttulo1"/>
       </w:pPr>
-      <w:bookmarkStart w:id="5" w:name="_Toc227660518"/>
+      <w:bookmarkStart w:id="5" w:name="_Toc227661611"/>
       <w:proofErr w:type="spellStart"/>
       <w:r>
         <w:t>Promt</w:t>
@@ -13101,7 +13169,7 @@
       <w:pPr>
         <w:pStyle w:val="Ttulo1"/>
       </w:pPr>
-      <w:bookmarkStart w:id="6" w:name="_Toc227660519"/>
+      <w:bookmarkStart w:id="6" w:name="_Toc227661612"/>
       <w:proofErr w:type="spellStart"/>
       <w:r>
         <w:t>Promt</w:t>
@@ -13184,7 +13252,7 @@
       <w:pPr>
         <w:pStyle w:val="Ttulo1"/>
       </w:pPr>
-      <w:bookmarkStart w:id="7" w:name="_Toc227660520"/>
+      <w:bookmarkStart w:id="7" w:name="_Toc227661613"/>
       <w:proofErr w:type="spellStart"/>
       <w:r>
         <w:lastRenderedPageBreak/>
@@ -13271,7 +13339,7 @@
       <w:pPr>
         <w:pStyle w:val="Ttulo1"/>
       </w:pPr>
-      <w:bookmarkStart w:id="8" w:name="_Toc227660521"/>
+      <w:bookmarkStart w:id="8" w:name="_Toc227661614"/>
       <w:proofErr w:type="spellStart"/>
       <w:r>
         <w:t>Promt</w:t>
@@ -13333,7 +13401,7 @@
       <w:pPr>
         <w:pStyle w:val="Ttulo1"/>
       </w:pPr>
-      <w:bookmarkStart w:id="9" w:name="_Toc227660522"/>
+      <w:bookmarkStart w:id="9" w:name="_Toc227661615"/>
       <w:proofErr w:type="spellStart"/>
       <w:r>
         <w:t>Promt</w:t>
@@ -13443,7 +13511,7 @@
       <w:pPr>
         <w:pStyle w:val="Ttulo1"/>
       </w:pPr>
-      <w:bookmarkStart w:id="10" w:name="_Toc227660523"/>
+      <w:bookmarkStart w:id="10" w:name="_Toc227661616"/>
       <w:proofErr w:type="spellStart"/>
       <w:r>
         <w:t>Promt</w:t>
@@ -13502,7 +13570,7 @@
       <w:pPr>
         <w:pStyle w:val="Ttulo1"/>
       </w:pPr>
-      <w:bookmarkStart w:id="11" w:name="_Toc227660524"/>
+      <w:bookmarkStart w:id="11" w:name="_Toc227661617"/>
       <w:proofErr w:type="spellStart"/>
       <w:r>
         <w:t>Promt</w:t>
@@ -13568,7 +13636,7 @@
       <w:pPr>
         <w:pStyle w:val="Ttulo1"/>
       </w:pPr>
-      <w:bookmarkStart w:id="12" w:name="_Toc227660525"/>
+      <w:bookmarkStart w:id="12" w:name="_Toc227661618"/>
       <w:proofErr w:type="spellStart"/>
       <w:r>
         <w:t>Promt</w:t>
@@ -13673,7 +13741,7 @@
       <w:pPr>
         <w:pStyle w:val="Ttulo1"/>
       </w:pPr>
-      <w:bookmarkStart w:id="13" w:name="_Toc227660526"/>
+      <w:bookmarkStart w:id="13" w:name="_Toc227661619"/>
       <w:proofErr w:type="spellStart"/>
       <w:r>
         <w:t>Promt</w:t>
@@ -13714,7 +13782,7 @@
       <w:pPr>
         <w:pStyle w:val="Ttulo1"/>
       </w:pPr>
-      <w:bookmarkStart w:id="14" w:name="_Toc227660527"/>
+      <w:bookmarkStart w:id="14" w:name="_Toc227661620"/>
       <w:proofErr w:type="spellStart"/>
       <w:r>
         <w:t>Promt</w:t>
@@ -13752,7 +13820,7 @@
       <w:pPr>
         <w:pStyle w:val="Ttulo1"/>
       </w:pPr>
-      <w:bookmarkStart w:id="15" w:name="_Toc227660528"/>
+      <w:bookmarkStart w:id="15" w:name="_Toc227661621"/>
       <w:proofErr w:type="spellStart"/>
       <w:r>
         <w:lastRenderedPageBreak/>
@@ -13887,7 +13955,7 @@
       <w:pPr>
         <w:pStyle w:val="Ttulo1"/>
       </w:pPr>
-      <w:bookmarkStart w:id="16" w:name="_Toc227660529"/>
+      <w:bookmarkStart w:id="16" w:name="_Toc227661622"/>
       <w:proofErr w:type="spellStart"/>
       <w:r>
         <w:t>Promt</w:t>
@@ -14232,7 +14300,7 @@
       <w:pPr>
         <w:pStyle w:val="Ttulo1"/>
       </w:pPr>
-      <w:bookmarkStart w:id="17" w:name="_Toc227660530"/>
+      <w:bookmarkStart w:id="17" w:name="_Toc227661623"/>
       <w:proofErr w:type="spellStart"/>
       <w:r>
         <w:t>Promt</w:t>
@@ -14299,7 +14367,7 @@
       <w:pPr>
         <w:pStyle w:val="Ttulo1"/>
       </w:pPr>
-      <w:bookmarkStart w:id="18" w:name="_Toc227660531"/>
+      <w:bookmarkStart w:id="18" w:name="_Toc227661624"/>
       <w:proofErr w:type="spellStart"/>
       <w:r>
         <w:t>Promt</w:t>
@@ -14351,7 +14419,7 @@
       <w:pPr>
         <w:pStyle w:val="Ttulo1"/>
       </w:pPr>
-      <w:bookmarkStart w:id="19" w:name="_Toc227660532"/>
+      <w:bookmarkStart w:id="19" w:name="_Toc227661625"/>
       <w:proofErr w:type="spellStart"/>
       <w:r>
         <w:lastRenderedPageBreak/>
@@ -14423,7 +14491,7 @@
       <w:pPr>
         <w:pStyle w:val="Ttulo1"/>
       </w:pPr>
-      <w:bookmarkStart w:id="20" w:name="_Toc227660533"/>
+      <w:bookmarkStart w:id="20" w:name="_Toc227661626"/>
       <w:proofErr w:type="spellStart"/>
       <w:r>
         <w:t>Promt</w:t>
@@ -14472,7 +14540,7 @@
       <w:pPr>
         <w:pStyle w:val="Ttulo1"/>
       </w:pPr>
-      <w:bookmarkStart w:id="21" w:name="_Toc227660534"/>
+      <w:bookmarkStart w:id="21" w:name="_Toc227661627"/>
       <w:proofErr w:type="spellStart"/>
       <w:r>
         <w:t>Promt</w:t>
@@ -14521,7 +14589,7 @@
       <w:pPr>
         <w:pStyle w:val="Ttulo1"/>
       </w:pPr>
-      <w:bookmarkStart w:id="22" w:name="_Toc227660535"/>
+      <w:bookmarkStart w:id="22" w:name="_Toc227661628"/>
       <w:proofErr w:type="spellStart"/>
       <w:r>
         <w:t>Promt</w:t>
@@ -14562,7 +14630,7 @@
       <w:pPr>
         <w:pStyle w:val="Ttulo1"/>
       </w:pPr>
-      <w:bookmarkStart w:id="23" w:name="_Toc227660536"/>
+      <w:bookmarkStart w:id="23" w:name="_Toc227661629"/>
       <w:proofErr w:type="spellStart"/>
       <w:r>
         <w:t>Promt</w:t>
@@ -14589,7 +14657,7 @@
       <w:pPr>
         <w:pStyle w:val="Ttulo1"/>
       </w:pPr>
-      <w:bookmarkStart w:id="24" w:name="_Toc227660537"/>
+      <w:bookmarkStart w:id="24" w:name="_Toc227661630"/>
       <w:proofErr w:type="spellStart"/>
       <w:r>
         <w:lastRenderedPageBreak/>
@@ -14623,7 +14691,7 @@
       <w:pPr>
         <w:pStyle w:val="Ttulo1"/>
       </w:pPr>
-      <w:bookmarkStart w:id="25" w:name="_Toc227660538"/>
+      <w:bookmarkStart w:id="25" w:name="_Toc227661631"/>
       <w:proofErr w:type="spellStart"/>
       <w:r>
         <w:t>Promt</w:t>
@@ -14637,206 +14705,235 @@
       </w:r>
       <w:bookmarkEnd w:id="25"/>
     </w:p>
+    <w:p>
+      <w:r>
+        <w:t xml:space="preserve">Bien, he visto que </w:t>
+      </w:r>
+      <w:r>
+        <w:t xml:space="preserve">los juegos de mesa no están teniendo en cuenta la tabla </w:t>
+      </w:r>
+      <w:proofErr w:type="spellStart"/>
+      <w:r>
+        <w:t>boardgame_type</w:t>
+      </w:r>
+      <w:proofErr w:type="spellEnd"/>
+      <w:r>
+        <w:t>, donde se indican a que tipos pertenece cada juego. Tiene que tenerlo en cuenta tanto al cargar/editar la ficha para mostrar los tipos a los que pertenece, como al guardarlo cuando se crea o edita un juego. Te paso la estructura de la tabla que no te pasé inicialmente:</w:t>
+      </w:r>
+      <w:r>
+        <w:br/>
+      </w:r>
+      <w:proofErr w:type="spellStart"/>
+      <w:r>
+        <w:t>Schema</w:t>
+      </w:r>
+      <w:proofErr w:type="spellEnd"/>
+      <w:proofErr w:type="gramStart"/>
+      <w:r>
+        <w:t>::</w:t>
+      </w:r>
+      <w:proofErr w:type="spellStart"/>
+      <w:r>
+        <w:t>create</w:t>
+      </w:r>
+      <w:proofErr w:type="spellEnd"/>
+      <w:proofErr w:type="gramEnd"/>
+      <w:r>
+        <w:t>('</w:t>
+      </w:r>
+      <w:proofErr w:type="spellStart"/>
+      <w:r>
+        <w:t>boardgame_type</w:t>
+      </w:r>
+      <w:proofErr w:type="spellEnd"/>
+      <w:r>
+        <w:t xml:space="preserve">', </w:t>
+      </w:r>
+      <w:proofErr w:type="spellStart"/>
+      <w:r>
+        <w:t>function</w:t>
+      </w:r>
+      <w:proofErr w:type="spellEnd"/>
+      <w:r>
+        <w:t xml:space="preserve"> (</w:t>
+      </w:r>
+      <w:proofErr w:type="spellStart"/>
+      <w:r>
+        <w:t>Blueprint</w:t>
+      </w:r>
+      <w:proofErr w:type="spellEnd"/>
+      <w:r>
+        <w:t xml:space="preserve"> $</w:t>
+      </w:r>
+      <w:proofErr w:type="spellStart"/>
+      <w:r>
+        <w:t>table</w:t>
+      </w:r>
+      <w:proofErr w:type="spellEnd"/>
+      <w:r>
+        <w:t>) {</w:t>
+      </w:r>
+    </w:p>
+    <w:p>
+      <w:pPr>
+        <w:spacing w:line="240" w:lineRule="auto"/>
+      </w:pPr>
+      <w:r>
+        <w:t>$</w:t>
+      </w:r>
+      <w:proofErr w:type="spellStart"/>
+      <w:r>
+        <w:t>table</w:t>
+      </w:r>
+      <w:proofErr w:type="spellEnd"/>
+      <w:r>
+        <w:t>-&gt;</w:t>
+      </w:r>
+      <w:proofErr w:type="gramStart"/>
+      <w:r>
+        <w:t>id(</w:t>
+      </w:r>
+      <w:proofErr w:type="gramEnd"/>
+      <w:r>
+        <w:t>);</w:t>
+      </w:r>
+    </w:p>
+    <w:p>
+      <w:pPr>
+        <w:spacing w:line="240" w:lineRule="auto"/>
+      </w:pPr>
+      <w:r>
+        <w:t>$table-&gt;</w:t>
+      </w:r>
+      <w:proofErr w:type="gramStart"/>
+      <w:r>
+        <w:t>foreignId(</w:t>
+      </w:r>
+      <w:proofErr w:type="gramEnd"/>
+      <w:r>
+        <w:t>'boardgame_id')-&gt;constrained('boardgames')-&gt;onDelete('cascade');</w:t>
+      </w:r>
+    </w:p>
+    <w:p>
+      <w:pPr>
+        <w:spacing w:line="240" w:lineRule="auto"/>
+      </w:pPr>
+      <w:r>
+        <w:t>$table-&gt;</w:t>
+      </w:r>
+      <w:proofErr w:type="gramStart"/>
+      <w:r>
+        <w:t>foreignId(</w:t>
+      </w:r>
+      <w:proofErr w:type="gramEnd"/>
+      <w:r>
+        <w:t xml:space="preserve">'type_id')-&gt;constrained('types')-&gt;onDelete('cascade'); </w:t>
+      </w:r>
+    </w:p>
+    <w:p>
+      <w:pPr>
+        <w:spacing w:line="240" w:lineRule="auto"/>
+      </w:pPr>
+      <w:r>
+        <w:t>$</w:t>
+      </w:r>
+      <w:proofErr w:type="spellStart"/>
+      <w:r>
+        <w:t>table</w:t>
+      </w:r>
+      <w:proofErr w:type="spellEnd"/>
+      <w:r>
+        <w:t>-&gt;</w:t>
+      </w:r>
+      <w:proofErr w:type="spellStart"/>
+      <w:proofErr w:type="gramStart"/>
+      <w:r>
+        <w:t>timestamps</w:t>
+      </w:r>
+      <w:proofErr w:type="spellEnd"/>
+      <w:r>
+        <w:t>(</w:t>
+      </w:r>
+      <w:proofErr w:type="gramEnd"/>
+      <w:r>
+        <w:t>);</w:t>
+      </w:r>
+    </w:p>
+    <w:p>
+      <w:pPr>
+        <w:spacing w:line="240" w:lineRule="auto"/>
+      </w:pPr>
+      <w:r>
+        <w:t>$</w:t>
+      </w:r>
+      <w:proofErr w:type="spellStart"/>
+      <w:r>
+        <w:t>table</w:t>
+      </w:r>
+      <w:proofErr w:type="spellEnd"/>
+      <w:r>
+        <w:t>-&gt;</w:t>
+      </w:r>
+      <w:proofErr w:type="spellStart"/>
+      <w:proofErr w:type="gramStart"/>
+      <w:r>
+        <w:t>unique</w:t>
+      </w:r>
+      <w:proofErr w:type="spellEnd"/>
+      <w:r>
+        <w:t>(</w:t>
+      </w:r>
+      <w:proofErr w:type="gramEnd"/>
+      <w:r>
+        <w:t>['</w:t>
+      </w:r>
+      <w:proofErr w:type="spellStart"/>
+      <w:r>
+        <w:t>boardgame_id','type_id</w:t>
+      </w:r>
+      <w:proofErr w:type="spellEnd"/>
+      <w:r>
+        <w:t xml:space="preserve">']);           </w:t>
+      </w:r>
+    </w:p>
+    <w:p>
+      <w:pPr>
+        <w:spacing w:line="240" w:lineRule="auto"/>
+      </w:pPr>
+      <w:r>
+        <w:t>});</w:t>
+      </w:r>
+    </w:p>
     <w:p/>
     <w:p>
-      <w:r>
-        <w:t xml:space="preserve">Bien, he visto que </w:t>
-      </w:r>
-      <w:r>
-        <w:t xml:space="preserve">los juegos de mesa no están teniendo en cuenta la tabla </w:t>
-      </w:r>
-      <w:proofErr w:type="spellStart"/>
-      <w:r>
-        <w:t>boardgame_type</w:t>
-      </w:r>
-      <w:proofErr w:type="spellEnd"/>
-      <w:r>
-        <w:t>, donde se indican a que tipos pertenece cada juego. Tiene que tenerlo en cuenta tanto al cargar/editar la ficha para mostrar los tipos a los que pertenece, como al guardarlo cuando se crea o edita un juego. Te paso la estructura de la tabla que no te pasé inicialmente:</w:t>
-      </w:r>
-      <w:r>
-        <w:br/>
-      </w:r>
-      <w:proofErr w:type="spellStart"/>
-      <w:r>
-        <w:t>Schema</w:t>
-      </w:r>
-      <w:proofErr w:type="spellEnd"/>
-      <w:proofErr w:type="gramStart"/>
-      <w:r>
-        <w:t>::</w:t>
-      </w:r>
-      <w:proofErr w:type="spellStart"/>
-      <w:r>
-        <w:t>create</w:t>
-      </w:r>
-      <w:proofErr w:type="spellEnd"/>
-      <w:proofErr w:type="gramEnd"/>
-      <w:r>
-        <w:t>('</w:t>
-      </w:r>
-      <w:proofErr w:type="spellStart"/>
-      <w:r>
-        <w:t>boardgame_type</w:t>
-      </w:r>
-      <w:proofErr w:type="spellEnd"/>
-      <w:r>
-        <w:t xml:space="preserve">', </w:t>
-      </w:r>
-      <w:proofErr w:type="spellStart"/>
-      <w:r>
-        <w:t>function</w:t>
-      </w:r>
-      <w:proofErr w:type="spellEnd"/>
-      <w:r>
-        <w:t xml:space="preserve"> (</w:t>
-      </w:r>
-      <w:proofErr w:type="spellStart"/>
-      <w:r>
-        <w:t>Blueprint</w:t>
-      </w:r>
-      <w:proofErr w:type="spellEnd"/>
-      <w:r>
-        <w:t xml:space="preserve"> $</w:t>
-      </w:r>
-      <w:proofErr w:type="spellStart"/>
-      <w:r>
-        <w:t>table</w:t>
-      </w:r>
-      <w:proofErr w:type="spellEnd"/>
-      <w:r>
-        <w:t>) {</w:t>
-      </w:r>
-    </w:p>
-    <w:p>
-      <w:pPr>
-        <w:spacing w:line="240" w:lineRule="auto"/>
-      </w:pPr>
-      <w:r>
-        <w:t>$</w:t>
-      </w:r>
-      <w:proofErr w:type="spellStart"/>
-      <w:r>
-        <w:t>table</w:t>
-      </w:r>
-      <w:proofErr w:type="spellEnd"/>
-      <w:r>
-        <w:t>-&gt;</w:t>
-      </w:r>
-      <w:proofErr w:type="gramStart"/>
-      <w:r>
-        <w:t>id(</w:t>
-      </w:r>
-      <w:proofErr w:type="gramEnd"/>
-      <w:r>
-        <w:t>);</w:t>
-      </w:r>
-    </w:p>
-    <w:p>
-      <w:pPr>
-        <w:spacing w:line="240" w:lineRule="auto"/>
-      </w:pPr>
-      <w:r>
-        <w:t>$table-&gt;</w:t>
-      </w:r>
-      <w:proofErr w:type="gramStart"/>
-      <w:r>
-        <w:t>foreignId(</w:t>
-      </w:r>
-      <w:proofErr w:type="gramEnd"/>
-      <w:r>
-        <w:t>'boardgame_id')-&gt;constrained('boardgames')-&gt;onDelete('cascade');</w:t>
-      </w:r>
-    </w:p>
-    <w:p>
-      <w:pPr>
-        <w:spacing w:line="240" w:lineRule="auto"/>
-      </w:pPr>
-      <w:r>
-        <w:t>$table-&gt;</w:t>
-      </w:r>
-      <w:proofErr w:type="gramStart"/>
-      <w:r>
-        <w:t>foreignId(</w:t>
-      </w:r>
-      <w:proofErr w:type="gramEnd"/>
-      <w:r>
-        <w:t xml:space="preserve">'type_id')-&gt;constrained('types')-&gt;onDelete('cascade'); </w:t>
-      </w:r>
-    </w:p>
-    <w:p>
-      <w:pPr>
-        <w:spacing w:line="240" w:lineRule="auto"/>
-      </w:pPr>
-      <w:r>
-        <w:t>$</w:t>
-      </w:r>
-      <w:proofErr w:type="spellStart"/>
-      <w:r>
-        <w:t>table</w:t>
-      </w:r>
-      <w:proofErr w:type="spellEnd"/>
-      <w:r>
-        <w:t>-&gt;</w:t>
-      </w:r>
-      <w:proofErr w:type="spellStart"/>
-      <w:proofErr w:type="gramStart"/>
-      <w:r>
-        <w:t>timestamps</w:t>
-      </w:r>
-      <w:proofErr w:type="spellEnd"/>
-      <w:r>
-        <w:t>(</w:t>
-      </w:r>
-      <w:proofErr w:type="gramEnd"/>
-      <w:r>
-        <w:t>);</w:t>
-      </w:r>
-    </w:p>
-    <w:p>
-      <w:pPr>
-        <w:spacing w:line="240" w:lineRule="auto"/>
-      </w:pPr>
-      <w:r>
-        <w:t>$</w:t>
-      </w:r>
-      <w:proofErr w:type="spellStart"/>
-      <w:r>
-        <w:t>table</w:t>
-      </w:r>
-      <w:proofErr w:type="spellEnd"/>
-      <w:r>
-        <w:t>-&gt;</w:t>
-      </w:r>
-      <w:proofErr w:type="spellStart"/>
-      <w:proofErr w:type="gramStart"/>
-      <w:r>
-        <w:t>unique</w:t>
-      </w:r>
-      <w:proofErr w:type="spellEnd"/>
-      <w:r>
-        <w:t>(</w:t>
-      </w:r>
-      <w:proofErr w:type="gramEnd"/>
-      <w:r>
-        <w:t>['</w:t>
-      </w:r>
-      <w:proofErr w:type="spellStart"/>
-      <w:r>
-        <w:t>boardgame_id','type_id</w:t>
-      </w:r>
-      <w:proofErr w:type="spellEnd"/>
-      <w:r>
-        <w:t xml:space="preserve">']);           </w:t>
-      </w:r>
-    </w:p>
-    <w:p>
-      <w:pPr>
-        <w:spacing w:line="240" w:lineRule="auto"/>
-      </w:pPr>
-      <w:r>
-        <w:t>});</w:t>
-      </w:r>
-    </w:p>
+      <w:pPr>
+        <w:pStyle w:val="Ttulo1"/>
+      </w:pPr>
+      <w:bookmarkStart w:id="26" w:name="_Toc227661632"/>
+      <w:proofErr w:type="spellStart"/>
+      <w:r>
+        <w:t>Promt</w:t>
+      </w:r>
+      <w:proofErr w:type="spellEnd"/>
+      <w:r>
+        <w:t xml:space="preserve"> 27 – </w:t>
+      </w:r>
+      <w:proofErr w:type="spellStart"/>
+      <w:r>
+        <w:t>Readme</w:t>
+      </w:r>
+      <w:bookmarkEnd w:id="26"/>
+      <w:proofErr w:type="spellEnd"/>
+    </w:p>
+    <w:p>
+      <w:r>
+        <w:rPr>
+          <w:rFonts w:eastAsiaTheme="majorEastAsia"/>
+        </w:rPr>
+        <w:t>Me puedes hacer el fichero readme.md del proyecto</w:t>
+      </w:r>
+    </w:p>
+    <w:p/>
     <w:sectPr>
       <w:pgSz w:w="11906" w:h="16838"/>
       <w:pgMar w:top="1417" w:right="1701" w:bottom="1417" w:left="1701" w:header="708" w:footer="708" w:gutter="0"/>
@@ -15034,7 +15131,6 @@
   <w:style w:type="character" w:default="1" w:styleId="Fuentedeprrafopredeter">
     <w:name w:val="Default Paragraph Font"/>
     <w:uiPriority w:val="1"/>
-    <w:semiHidden/>
     <w:unhideWhenUsed/>
   </w:style>
   <w:style w:type="table" w:default="1" w:styleId="Tablanormal">

</xml_diff>